<commit_message>
v4.2: Export command + User Guide .docx
</commit_message>
<xml_diff>
--- a/Polymarket_Bot_User_Guide.docx
+++ b/Polymarket_Bot_User_Guide.docx
@@ -2,67 +2,13 @@
 <file path=word/document.xml><?xml version="1.0" encoding="utf-8"?>
 <w:document xmlns:wpc="http://schemas.microsoft.com/office/word/2010/wordprocessingCanvas" xmlns:mo="http://schemas.microsoft.com/office/mac/office/2008/main" xmlns:mc="http://schemas.openxmlformats.org/markup-compatibility/2006" xmlns:mv="urn:schemas-microsoft-com:mac:vml" xmlns:o="urn:schemas-microsoft-com:office:office" xmlns:r="http://schemas.openxmlformats.org/officeDocument/2006/relationships" xmlns:m="http://schemas.openxmlformats.org/officeDocument/2006/math" xmlns:v="urn:schemas-microsoft-com:vml" xmlns:wp14="http://schemas.microsoft.com/office/word/2010/wordprocessingDrawing" xmlns:wp="http://schemas.openxmlformats.org/drawingml/2006/wordprocessingDrawing" xmlns:w10="urn:schemas-microsoft-com:office:word" xmlns:w="http://schemas.openxmlformats.org/wordprocessingml/2006/main" xmlns:w14="http://schemas.microsoft.com/office/word/2010/wordml" xmlns:wpg="http://schemas.microsoft.com/office/word/2010/wordprocessingGroup" xmlns:wpi="http://schemas.microsoft.com/office/word/2010/wordprocessingInk" xmlns:wne="http://schemas.microsoft.com/office/word/2006/wordml" xmlns:wps="http://schemas.microsoft.com/office/word/2010/wordprocessingShape" mc:Ignorable="w14 wp14">
   <w:body>
-    <w:p/>
-    <w:p/>
     <w:p>
       <w:pPr>
+        <w:pStyle w:val="Title"/>
         <w:jc w:val="center"/>
       </w:pPr>
       <w:r>
-        <w:rPr>
-          <w:b/>
-          <w:color w:val="1A1A2E"/>
-          <w:sz w:val="56"/>
-        </w:rPr>
-        <w:t>POLYMARKET TELEGRAM BOT</w:t>
-      </w:r>
-    </w:p>
-    <w:p>
-      <w:pPr>
-        <w:jc w:val="center"/>
-      </w:pPr>
-      <w:r>
-        <w:rPr>
-          <w:color w:val="555577"/>
-          <w:sz w:val="36"/>
-        </w:rPr>
-        <w:t>User Guide &amp; Documentation</w:t>
-      </w:r>
-    </w:p>
-    <w:p/>
-    <w:p>
-      <w:pPr>
-        <w:jc w:val="center"/>
-      </w:pPr>
-      <w:r>
-        <w:rPr>
-          <w:color w:val="777799"/>
-          <w:sz w:val="28"/>
-        </w:rPr>
-        <w:t>Version 3.0</w:t>
-      </w:r>
-    </w:p>
-    <w:p/>
-    <w:p/>
-    <w:p>
-      <w:pPr>
-        <w:jc w:val="center"/>
-      </w:pPr>
-      <w:r>
-        <w:rPr>
-          <w:color w:val="666666"/>
-          <w:sz w:val="24"/>
-        </w:rPr>
-        <w:t>A professional automated trading bot for Polymarket prediction markets.</w:t>
-        <w:br/>
-        <w:t>Fully controlled via Telegram with real-time notifications,</w:t>
-        <w:br/>
-        <w:t>configurable parameters, and automatic trade management.</w:t>
-      </w:r>
-    </w:p>
-    <w:p>
-      <w:r>
-        <w:br w:type="page"/>
+        <w:t>Polymarket Telegram Bot v3.0 — User Guide</w:t>
       </w:r>
     </w:p>
     <w:p>
@@ -70,212 +16,12 @@
         <w:pStyle w:val="Heading1"/>
       </w:pPr>
       <w:r>
-        <w:t>Table of Contents</w:t>
-      </w:r>
-    </w:p>
-    <w:p>
-      <w:pPr>
-        <w:spacing w:after="40"/>
-      </w:pPr>
-      <w:r>
-        <w:t>1. Overview</w:t>
-      </w:r>
-    </w:p>
-    <w:p>
-      <w:pPr>
-        <w:spacing w:after="40"/>
-      </w:pPr>
-      <w:r>
-        <w:t>2. System Requirements</w:t>
-      </w:r>
-    </w:p>
-    <w:p>
-      <w:pPr>
-        <w:spacing w:after="40"/>
-      </w:pPr>
-      <w:r>
-        <w:t>3. Installation &amp; Setup</w:t>
-      </w:r>
-    </w:p>
-    <w:p>
-      <w:pPr>
-        <w:spacing w:after="40"/>
-      </w:pPr>
-      <w:r>
-        <w:t xml:space="preserve">   3.1 Clone the Repository</w:t>
-      </w:r>
-    </w:p>
-    <w:p>
-      <w:pPr>
-        <w:spacing w:after="40"/>
-      </w:pPr>
-      <w:r>
-        <w:t xml:space="preserve">   3.2 Install Dependencies</w:t>
-      </w:r>
-    </w:p>
-    <w:p>
-      <w:pPr>
-        <w:spacing w:after="40"/>
-      </w:pPr>
-      <w:r>
-        <w:t xml:space="preserve">   3.3 Configure Environment Variables</w:t>
-      </w:r>
-    </w:p>
-    <w:p>
-      <w:pPr>
-        <w:spacing w:after="40"/>
-      </w:pPr>
-      <w:r>
-        <w:t xml:space="preserve">   3.4 Create a Telegram Bot</w:t>
-      </w:r>
-    </w:p>
-    <w:p>
-      <w:pPr>
-        <w:spacing w:after="40"/>
-      </w:pPr>
-      <w:r>
-        <w:t xml:space="preserve">   3.5 Set Up Wallet &amp; Allowances</w:t>
-      </w:r>
-    </w:p>
-    <w:p>
-      <w:pPr>
-        <w:spacing w:after="40"/>
-      </w:pPr>
-      <w:r>
-        <w:t>4. Running the Bot</w:t>
-      </w:r>
-    </w:p>
-    <w:p>
-      <w:pPr>
-        <w:spacing w:after="40"/>
-      </w:pPr>
-      <w:r>
-        <w:t>5. Telegram Commands Reference</w:t>
-      </w:r>
-    </w:p>
-    <w:p>
-      <w:pPr>
-        <w:spacing w:after="40"/>
-      </w:pPr>
-      <w:r>
-        <w:t xml:space="preserve">   5.1 BTC Trading Commands</w:t>
-      </w:r>
-    </w:p>
-    <w:p>
-      <w:pPr>
-        <w:spacing w:after="40"/>
-      </w:pPr>
-      <w:r>
-        <w:t xml:space="preserve">   5.2 Custom Market Commands</w:t>
-      </w:r>
-    </w:p>
-    <w:p>
-      <w:pPr>
-        <w:spacing w:after="40"/>
-      </w:pPr>
-      <w:r>
-        <w:t xml:space="preserve">   5.3 Auto-Repeat Commands</w:t>
-      </w:r>
-    </w:p>
-    <w:p>
-      <w:pPr>
-        <w:spacing w:after="40"/>
-      </w:pPr>
-      <w:r>
-        <w:t xml:space="preserve">   5.4 Status &amp; Info Commands</w:t>
-      </w:r>
-    </w:p>
-    <w:p>
-      <w:pPr>
-        <w:spacing w:after="40"/>
-      </w:pPr>
-      <w:r>
-        <w:t xml:space="preserve">   5.5 Settings Commands</w:t>
-      </w:r>
-    </w:p>
-    <w:p>
-      <w:pPr>
-        <w:spacing w:after="40"/>
-      </w:pPr>
-      <w:r>
-        <w:t xml:space="preserve">   5.6 Control Commands</w:t>
-      </w:r>
-    </w:p>
-    <w:p>
-      <w:pPr>
-        <w:spacing w:after="40"/>
-      </w:pPr>
-      <w:r>
-        <w:t>6. Trading Workflow</w:t>
-      </w:r>
-    </w:p>
-    <w:p>
-      <w:pPr>
-        <w:spacing w:after="40"/>
-      </w:pPr>
-      <w:r>
-        <w:t xml:space="preserve">   6.1 Manual BTC Trading</w:t>
-      </w:r>
-    </w:p>
-    <w:p>
-      <w:pPr>
-        <w:spacing w:after="40"/>
-      </w:pPr>
-      <w:r>
-        <w:t xml:space="preserve">   6.2 Custom Market Trading</w:t>
-      </w:r>
-    </w:p>
-    <w:p>
-      <w:pPr>
-        <w:spacing w:after="40"/>
-      </w:pPr>
-      <w:r>
-        <w:t xml:space="preserve">   6.3 Auto-Repeat Mode</w:t>
-      </w:r>
-    </w:p>
-    <w:p>
-      <w:pPr>
-        <w:spacing w:after="40"/>
-      </w:pPr>
-      <w:r>
-        <w:t>7. Risk Management</w:t>
-      </w:r>
-    </w:p>
-    <w:p>
-      <w:pPr>
-        <w:spacing w:after="40"/>
-      </w:pPr>
-      <w:r>
-        <w:t>8. Configuration Reference</w:t>
-      </w:r>
-    </w:p>
-    <w:p>
-      <w:pPr>
-        <w:spacing w:after="40"/>
-      </w:pPr>
-      <w:r>
-        <w:t>9. Auto-Redeem Feature</w:t>
-      </w:r>
-    </w:p>
-    <w:p>
-      <w:pPr>
-        <w:spacing w:after="40"/>
-      </w:pPr>
-      <w:r>
-        <w:t>10. Troubleshooting</w:t>
-      </w:r>
-    </w:p>
-    <w:p>
-      <w:pPr>
-        <w:spacing w:after="40"/>
-      </w:pPr>
-      <w:r>
-        <w:t>11. Security Best Practices</w:t>
+        <w:t>1. Introduction</w:t>
       </w:r>
     </w:p>
     <w:p>
       <w:r>
-        <w:br w:type="page"/>
+        <w:t>This bot is a comprehensive trading solution for Polymarket, designed to be controlled entirely through Telegram. It supports manual trading, automated repeat strategies, scheduled trades, and advanced analytics with Excel logging.</w:t>
       </w:r>
     </w:p>
     <w:p>
@@ -283,17 +29,7 @@
         <w:pStyle w:val="Heading1"/>
       </w:pPr>
       <w:r>
-        <w:t>1. Overview</w:t>
-      </w:r>
-    </w:p>
-    <w:p>
-      <w:r>
-        <w:t>The Polymarket Telegram Bot is a professional trading bot that enables you to trade on Polymarket prediction markets directly from your Telegram app. It supports both BTC UP/DOWN markets and any custom Polymarket event.</w:t>
-      </w:r>
-    </w:p>
-    <w:p>
-      <w:r>
-        <w:t>Key features include:</w:t>
+        <w:t>2. Key Features</w:t>
       </w:r>
     </w:p>
     <w:p>
@@ -301,7 +37,7 @@
         <w:pStyle w:val="ListBullet"/>
       </w:pPr>
       <w:r>
-        <w:t>Manual BUY/SELL via Telegram commands (/buy up, /buy down, /sell)</w:t>
+        <w:t>Manual Trading: Search and trade any Polymarket event directly from chat.</w:t>
       </w:r>
     </w:p>
     <w:p>
@@ -309,7 +45,7 @@
         <w:pStyle w:val="ListBullet"/>
       </w:pPr>
       <w:r>
-        <w:t>Search and trade ANY Polymarket event (/search, /trade)</w:t>
+        <w:t>Auto-Repeat: Automatically place the same trade direction whenever a market resolves.</w:t>
       </w:r>
     </w:p>
     <w:p>
@@ -317,7 +53,7 @@
         <w:pStyle w:val="ListBullet"/>
       </w:pPr>
       <w:r>
-        <w:t>Automatic Take-Profit (TP) and Stop-Loss (SL) monitoring</w:t>
+        <w:t>Scheduled Trading: Tell the bot exactly when to buy (e.g., at a specific time today).</w:t>
       </w:r>
     </w:p>
     <w:p>
@@ -325,7 +61,7 @@
         <w:pStyle w:val="ListBullet"/>
       </w:pPr>
       <w:r>
-        <w:t>Auto-repeat: automatically re-bet when a market resolves</w:t>
+        <w:t>Excel Logging: Full audit trail of every trade and event in 'trade_log.xlsx'.</w:t>
       </w:r>
     </w:p>
     <w:p>
@@ -333,7 +69,7 @@
         <w:pStyle w:val="ListBullet"/>
       </w:pPr>
       <w:r>
-        <w:t>Auto-redeem: winning tokens are automatically converted back to USDC</w:t>
+        <w:t>Backtest System: Run simulations based on your history and view results in 'backtest_log.xlsx'.</w:t>
       </w:r>
     </w:p>
     <w:p>
@@ -341,7 +77,7 @@
         <w:pStyle w:val="ListBullet"/>
       </w:pPr>
       <w:r>
-        <w:t>All parameters adjustable in real-time via Telegram (/set)</w:t>
+        <w:t>Paper Trading: Test everything without real money by setting PAPER_MODE=true.</w:t>
       </w:r>
     </w:p>
     <w:p>
@@ -349,23 +85,7 @@
         <w:pStyle w:val="ListBullet"/>
       </w:pPr>
       <w:r>
-        <w:t>Real-time notifications for trade opens, closes, and P&amp;L</w:t>
-      </w:r>
-    </w:p>
-    <w:p>
-      <w:pPr>
-        <w:pStyle w:val="ListBullet"/>
-      </w:pPr>
-      <w:r>
-        <w:t>Paper mode for risk-free testing before going live</w:t>
-      </w:r>
-    </w:p>
-    <w:p>
-      <w:pPr>
-        <w:pStyle w:val="ListBullet"/>
-      </w:pPr>
-      <w:r>
-        <w:t>Secure wallet integration with Polygon network</w:t>
+        <w:t>Live Parameter Control: Update TP, SL, stake, and more using Telegram commands while the bot is running.</w:t>
       </w:r>
     </w:p>
     <w:p>
@@ -373,180 +93,7 @@
         <w:pStyle w:val="Heading1"/>
       </w:pPr>
       <w:r>
-        <w:t>2. System Requirements</w:t>
-      </w:r>
-    </w:p>
-    <w:tbl>
-      <w:tblPr>
-        <w:tblStyle w:val="LightList-Accent1"/>
-        <w:tblW w:type="auto" w:w="0"/>
-        <w:tblLook w:firstColumn="1" w:firstRow="1" w:lastColumn="0" w:lastRow="0" w:noHBand="0" w:noVBand="1" w:val="04A0"/>
-      </w:tblPr>
-      <w:tblGrid>
-        <w:gridCol w:w="4703"/>
-        <w:gridCol w:w="4703"/>
-      </w:tblGrid>
-      <w:tr>
-        <w:tc>
-          <w:tcPr>
-            <w:tcW w:type="dxa" w:w="4703"/>
-          </w:tcPr>
-          <w:p>
-            <w:r>
-              <w:t>Requirement</w:t>
-            </w:r>
-          </w:p>
-        </w:tc>
-        <w:tc>
-          <w:tcPr>
-            <w:tcW w:type="dxa" w:w="4703"/>
-          </w:tcPr>
-          <w:p>
-            <w:r>
-              <w:t>Details</w:t>
-            </w:r>
-          </w:p>
-        </w:tc>
-      </w:tr>
-      <w:tr>
-        <w:tc>
-          <w:tcPr>
-            <w:tcW w:type="dxa" w:w="4703"/>
-          </w:tcPr>
-          <w:p>
-            <w:r>
-              <w:t>Operating System</w:t>
-            </w:r>
-          </w:p>
-        </w:tc>
-        <w:tc>
-          <w:tcPr>
-            <w:tcW w:type="dxa" w:w="4703"/>
-          </w:tcPr>
-          <w:p>
-            <w:r>
-              <w:t>Windows 10/11, macOS, or Linux</w:t>
-            </w:r>
-          </w:p>
-        </w:tc>
-      </w:tr>
-      <w:tr>
-        <w:tc>
-          <w:tcPr>
-            <w:tcW w:type="dxa" w:w="4703"/>
-          </w:tcPr>
-          <w:p>
-            <w:r>
-              <w:t>Python</w:t>
-            </w:r>
-          </w:p>
-        </w:tc>
-        <w:tc>
-          <w:tcPr>
-            <w:tcW w:type="dxa" w:w="4703"/>
-          </w:tcPr>
-          <w:p>
-            <w:r>
-              <w:t>Python 3.10 or higher</w:t>
-            </w:r>
-          </w:p>
-        </w:tc>
-      </w:tr>
-      <w:tr>
-        <w:tc>
-          <w:tcPr>
-            <w:tcW w:type="dxa" w:w="4703"/>
-          </w:tcPr>
-          <w:p>
-            <w:r>
-              <w:t>Internet</w:t>
-            </w:r>
-          </w:p>
-        </w:tc>
-        <w:tc>
-          <w:tcPr>
-            <w:tcW w:type="dxa" w:w="4703"/>
-          </w:tcPr>
-          <w:p>
-            <w:r>
-              <w:t>Stable internet connection required</w:t>
-            </w:r>
-          </w:p>
-        </w:tc>
-      </w:tr>
-      <w:tr>
-        <w:tc>
-          <w:tcPr>
-            <w:tcW w:type="dxa" w:w="4703"/>
-          </w:tcPr>
-          <w:p>
-            <w:r>
-              <w:t>Telegram</w:t>
-            </w:r>
-          </w:p>
-        </w:tc>
-        <w:tc>
-          <w:tcPr>
-            <w:tcW w:type="dxa" w:w="4703"/>
-          </w:tcPr>
-          <w:p>
-            <w:r>
-              <w:t>Telegram account with a bot created via @BotFather</w:t>
-            </w:r>
-          </w:p>
-        </w:tc>
-      </w:tr>
-      <w:tr>
-        <w:tc>
-          <w:tcPr>
-            <w:tcW w:type="dxa" w:w="4703"/>
-          </w:tcPr>
-          <w:p>
-            <w:r>
-              <w:t>Wallet</w:t>
-            </w:r>
-          </w:p>
-        </w:tc>
-        <w:tc>
-          <w:tcPr>
-            <w:tcW w:type="dxa" w:w="4703"/>
-          </w:tcPr>
-          <w:p>
-            <w:r>
-              <w:t>MetaMask or any Polygon-compatible wallet with private key</w:t>
-            </w:r>
-          </w:p>
-        </w:tc>
-      </w:tr>
-      <w:tr>
-        <w:tc>
-          <w:tcPr>
-            <w:tcW w:type="dxa" w:w="4703"/>
-          </w:tcPr>
-          <w:p>
-            <w:r>
-              <w:t>Funds</w:t>
-            </w:r>
-          </w:p>
-        </w:tc>
-        <w:tc>
-          <w:tcPr>
-            <w:tcW w:type="dxa" w:w="4703"/>
-          </w:tcPr>
-          <w:p>
-            <w:r>
-              <w:t>USDC.e on Polygon network + small amount of POL for gas</w:t>
-            </w:r>
-          </w:p>
-        </w:tc>
-      </w:tr>
-    </w:tbl>
-    <w:p>
-      <w:pPr>
-        <w:pStyle w:val="Heading1"/>
-      </w:pPr>
-      <w:r>
-        <w:t>3. Installation &amp; Setup</w:t>
+        <w:t>3. Telegram Commands Reference</w:t>
       </w:r>
     </w:p>
     <w:p>
@@ -554,108 +101,33 @@
         <w:pStyle w:val="Heading2"/>
       </w:pPr>
       <w:r>
-        <w:t>3.1 Clone the Repository</w:t>
-      </w:r>
-    </w:p>
-    <w:p>
-      <w:r>
-        <w:t>Open a terminal and run:</w:t>
-      </w:r>
-    </w:p>
-    <w:p>
-      <w:pPr>
-        <w:pStyle w:val="NoSpacing"/>
-      </w:pPr>
-      <w:r>
-        <w:t>git clone https://github.com/Shifrozy/Polymarkeet_telegram__bot.git</w:t>
-      </w:r>
-    </w:p>
-    <w:p>
-      <w:pPr>
-        <w:pStyle w:val="NoSpacing"/>
-      </w:pPr>
-      <w:r>
-        <w:t>cd Polymarkeet_telegram__bot</w:t>
-      </w:r>
-    </w:p>
-    <w:p>
-      <w:pPr>
-        <w:pStyle w:val="Heading2"/>
-      </w:pPr>
-      <w:r>
-        <w:t>3.2 Install Dependencies</w:t>
-      </w:r>
-    </w:p>
-    <w:p>
-      <w:r>
-        <w:t>Install all required Python packages:</w:t>
-      </w:r>
-    </w:p>
-    <w:p>
-      <w:pPr>
-        <w:pStyle w:val="NoSpacing"/>
-      </w:pPr>
-      <w:r>
-        <w:t>pip install -r requirements.txt</w:t>
-      </w:r>
-    </w:p>
-    <w:p/>
-    <w:p>
-      <w:r>
-        <w:t>Required packages: requests, python-dotenv, web3, py-clob-client, rich</w:t>
-      </w:r>
-    </w:p>
-    <w:p>
-      <w:pPr>
-        <w:pStyle w:val="Heading2"/>
-      </w:pPr>
-      <w:r>
-        <w:t>3.3 Configure Environment Variables</w:t>
-      </w:r>
-    </w:p>
-    <w:p>
-      <w:r>
-        <w:t>Copy the example configuration file:</w:t>
-      </w:r>
-    </w:p>
-    <w:p>
-      <w:pPr>
-        <w:pStyle w:val="NoSpacing"/>
-      </w:pPr>
-      <w:r>
-        <w:t>cp .env.example .env</w:t>
-      </w:r>
-    </w:p>
-    <w:p/>
-    <w:p>
-      <w:r>
-        <w:t>Then edit the .env file with your credentials:</w:t>
+        <w:t>🛒 Trading Commands</w:t>
       </w:r>
     </w:p>
     <w:tbl>
       <w:tblPr>
-        <w:tblStyle w:val="LightList-Accent1"/>
+        <w:tblStyle w:val="TableGrid"/>
         <w:tblW w:type="auto" w:w="0"/>
         <w:tblLook w:firstColumn="1" w:firstRow="1" w:lastColumn="0" w:lastRow="0" w:noHBand="0" w:noVBand="1" w:val="04A0"/>
       </w:tblPr>
       <w:tblGrid>
-        <w:gridCol w:w="4703"/>
-        <w:gridCol w:w="4703"/>
+        <w:gridCol w:w="4320"/>
+        <w:gridCol w:w="4320"/>
       </w:tblGrid>
       <w:tr>
         <w:tc>
           <w:tcPr>
-            <w:tcW w:type="dxa" w:w="4703"/>
+            <w:tcW w:type="dxa" w:w="4320"/>
           </w:tcPr>
           <w:p>
             <w:r>
-              <w:t>Variable</w:t>
+              <w:t>Command</w:t>
             </w:r>
           </w:p>
         </w:tc>
         <w:tc>
           <w:tcPr>
-            <w:tcW w:type="dxa" w:w="4703"/>
+            <w:tcW w:type="dxa" w:w="4320"/>
           </w:tcPr>
           <w:p>
             <w:r>
@@ -667,21 +139,21 @@
       <w:tr>
         <w:tc>
           <w:tcPr>
-            <w:tcW w:type="dxa" w:w="4703"/>
+            <w:tcW w:type="dxa" w:w="4320"/>
           </w:tcPr>
           <w:p>
             <w:r>
-              <w:t>PRIVATE_KEY</w:t>
+              <w:t>/buy up [tf]</w:t>
             </w:r>
           </w:p>
         </w:tc>
         <w:tc>
           <w:tcPr>
-            <w:tcW w:type="dxa" w:w="4703"/>
+            <w:tcW w:type="dxa" w:w="4320"/>
           </w:tcPr>
           <w:p>
             <w:r>
-              <w:t>Your Polygon wallet private key (from MetaMask)</w:t>
+              <w:t>Places a buy order for UP tokens. Optional timeframe (5m, 15m, 1h).</w:t>
             </w:r>
           </w:p>
         </w:tc>
@@ -689,21 +161,21 @@
       <w:tr>
         <w:tc>
           <w:tcPr>
-            <w:tcW w:type="dxa" w:w="4703"/>
+            <w:tcW w:type="dxa" w:w="4320"/>
           </w:tcPr>
           <w:p>
             <w:r>
-              <w:t>FUNDER_ADDRESS</w:t>
+              <w:t>/buy down [tf]</w:t>
             </w:r>
           </w:p>
         </w:tc>
         <w:tc>
           <w:tcPr>
-            <w:tcW w:type="dxa" w:w="4703"/>
+            <w:tcW w:type="dxa" w:w="4320"/>
           </w:tcPr>
           <w:p>
             <w:r>
-              <w:t>Your Polygon wallet address (0x...)</w:t>
+              <w:t>Places a buy order for DOWN tokens.</w:t>
             </w:r>
           </w:p>
         </w:tc>
@@ -711,21 +183,21 @@
       <w:tr>
         <w:tc>
           <w:tcPr>
-            <w:tcW w:type="dxa" w:w="4703"/>
+            <w:tcW w:type="dxa" w:w="4320"/>
           </w:tcPr>
           <w:p>
             <w:r>
-              <w:t>TELEGRAM_BOT_TOKEN</w:t>
+              <w:t>/sell</w:t>
             </w:r>
           </w:p>
         </w:tc>
         <w:tc>
           <w:tcPr>
-            <w:tcW w:type="dxa" w:w="4703"/>
+            <w:tcW w:type="dxa" w:w="4320"/>
           </w:tcPr>
           <w:p>
             <w:r>
-              <w:t>Bot token from @BotFather on Telegram</w:t>
+              <w:t>Manually closes the current open position at market price.</w:t>
             </w:r>
           </w:p>
         </w:tc>
@@ -733,21 +205,21 @@
       <w:tr>
         <w:tc>
           <w:tcPr>
-            <w:tcW w:type="dxa" w:w="4703"/>
+            <w:tcW w:type="dxa" w:w="4320"/>
           </w:tcPr>
           <w:p>
             <w:r>
-              <w:t>TELEGRAM_CHAT_ID</w:t>
+              <w:t>/search [query]</w:t>
             </w:r>
           </w:p>
         </w:tc>
         <w:tc>
           <w:tcPr>
-            <w:tcW w:type="dxa" w:w="4703"/>
+            <w:tcW w:type="dxa" w:w="4320"/>
           </w:tcPr>
           <w:p>
             <w:r>
-              <w:t>Your Telegram chat ID (from @userinfobot)</w:t>
+              <w:t>Search for specific markets (e.g., /search BTC).</w:t>
             </w:r>
           </w:p>
         </w:tc>
@@ -755,21 +227,21 @@
       <w:tr>
         <w:tc>
           <w:tcPr>
-            <w:tcW w:type="dxa" w:w="4703"/>
+            <w:tcW w:type="dxa" w:w="4320"/>
           </w:tcPr>
           <w:p>
             <w:r>
-              <w:t>PAPER_MODE</w:t>
+              <w:t>/trade [#] [outcome]</w:t>
             </w:r>
           </w:p>
         </w:tc>
         <w:tc>
           <w:tcPr>
-            <w:tcW w:type="dxa" w:w="4703"/>
+            <w:tcW w:type="dxa" w:w="4320"/>
           </w:tcPr>
           <w:p>
             <w:r>
-              <w:t>true = paper trading (no real money), false = live</w:t>
+              <w:t>Quick trade from search results (e.g., /trade 1 yes).</w:t>
             </w:r>
           </w:p>
         </w:tc>
@@ -777,87 +249,21 @@
       <w:tr>
         <w:tc>
           <w:tcPr>
-            <w:tcW w:type="dxa" w:w="4703"/>
+            <w:tcW w:type="dxa" w:w="4320"/>
           </w:tcPr>
           <w:p>
             <w:r>
-              <w:t>TRADE_AMOUNT</w:t>
+              <w:t>/trending</w:t>
             </w:r>
           </w:p>
         </w:tc>
         <w:tc>
           <w:tcPr>
-            <w:tcW w:type="dxa" w:w="4703"/>
+            <w:tcW w:type="dxa" w:w="4320"/>
           </w:tcPr>
           <w:p>
             <w:r>
-              <w:t>Amount in USDC per trade (default: 5.00)</w:t>
-            </w:r>
-          </w:p>
-        </w:tc>
-      </w:tr>
-      <w:tr>
-        <w:tc>
-          <w:tcPr>
-            <w:tcW w:type="dxa" w:w="4703"/>
-          </w:tcPr>
-          <w:p>
-            <w:r>
-              <w:t>TAKE_PROFIT_PCT</w:t>
-            </w:r>
-          </w:p>
-        </w:tc>
-        <w:tc>
-          <w:tcPr>
-            <w:tcW w:type="dxa" w:w="4703"/>
-          </w:tcPr>
-          <w:p>
-            <w:r>
-              <w:t>Take-profit percentage (default: 80%)</w:t>
-            </w:r>
-          </w:p>
-        </w:tc>
-      </w:tr>
-      <w:tr>
-        <w:tc>
-          <w:tcPr>
-            <w:tcW w:type="dxa" w:w="4703"/>
-          </w:tcPr>
-          <w:p>
-            <w:r>
-              <w:t>STOP_LOSS_PCT</w:t>
-            </w:r>
-          </w:p>
-        </w:tc>
-        <w:tc>
-          <w:tcPr>
-            <w:tcW w:type="dxa" w:w="4703"/>
-          </w:tcPr>
-          <w:p>
-            <w:r>
-              <w:t>Stop-loss percentage (default: 50%)</w:t>
-            </w:r>
-          </w:p>
-        </w:tc>
-      </w:tr>
-      <w:tr>
-        <w:tc>
-          <w:tcPr>
-            <w:tcW w:type="dxa" w:w="4703"/>
-          </w:tcPr>
-          <w:p>
-            <w:r>
-              <w:t>MAX_SLIPPAGE</w:t>
-            </w:r>
-          </w:p>
-        </w:tc>
-        <w:tc>
-          <w:tcPr>
-            <w:tcW w:type="dxa" w:w="4703"/>
-          </w:tcPr>
-          <w:p>
-            <w:r>
-              <w:t>Maximum slippage in USDC (default: 0.05)</w:t>
+              <w:t>List top trending markets on Polymarket.</w:t>
             </w:r>
           </w:p>
         </w:tc>
@@ -868,165 +274,51 @@
         <w:pStyle w:val="Heading2"/>
       </w:pPr>
       <w:r>
-        <w:t>3.4 Create a Telegram Bot</w:t>
+        <w:t>⏰ Automation &amp; Scheduling</w:t>
       </w:r>
     </w:p>
-    <w:p>
-      <w:r>
-        <w:t>1. Open Telegram and search for @BotFather</w:t>
-      </w:r>
-    </w:p>
-    <w:p>
-      <w:r>
-        <w:t>2. Send /newbot and follow the prompts to create a new bot</w:t>
-      </w:r>
-    </w:p>
-    <w:p>
-      <w:r>
-        <w:t>3. Copy the bot token and paste it into .env as TELEGRAM_BOT_TOKEN</w:t>
-      </w:r>
-    </w:p>
-    <w:p>
-      <w:r>
-        <w:t>4. Start a chat with your new bot and send any message</w:t>
-      </w:r>
-    </w:p>
-    <w:p>
-      <w:r>
-        <w:t>5. Search for @userinfobot on Telegram and send /start</w:t>
-      </w:r>
-    </w:p>
-    <w:p>
-      <w:r>
-        <w:t>6. Copy your Chat ID and paste it into .env as TELEGRAM_CHAT_ID</w:t>
-      </w:r>
-    </w:p>
-    <w:p>
-      <w:pPr>
-        <w:pStyle w:val="Heading2"/>
-      </w:pPr>
-      <w:r>
-        <w:t>3.5 Set Up Wallet &amp; Allowances</w:t>
-      </w:r>
-    </w:p>
-    <w:p>
-      <w:r>
-        <w:t>Before the bot can trade, you need to approve token spending on the Polymarket contracts. This only needs to be done ONCE:</w:t>
-      </w:r>
-    </w:p>
-    <w:p>
-      <w:pPr>
-        <w:pStyle w:val="NoSpacing"/>
-      </w:pPr>
-      <w:r>
-        <w:t>python setup_allowances.py</w:t>
-      </w:r>
-    </w:p>
-    <w:p/>
-    <w:p>
-      <w:r>
-        <w:t>This script will:</w:t>
-      </w:r>
-    </w:p>
-    <w:p>
-      <w:pPr>
-        <w:pStyle w:val="ListBullet"/>
-      </w:pPr>
-      <w:r>
-        <w:t>Connect to the Polygon network</w:t>
-      </w:r>
-    </w:p>
-    <w:p>
-      <w:pPr>
-        <w:pStyle w:val="ListBullet"/>
-      </w:pPr>
-      <w:r>
-        <w:t>Approve USDC spending for all 3 Polymarket exchange contracts</w:t>
-      </w:r>
-    </w:p>
-    <w:p>
-      <w:pPr>
-        <w:pStyle w:val="ListBullet"/>
-      </w:pPr>
-      <w:r>
-        <w:t>Approve Conditional Token (CTF) transfers for trading</w:t>
-      </w:r>
-    </w:p>
-    <w:p>
-      <w:pPr>
-        <w:pStyle w:val="ListBullet"/>
-      </w:pPr>
-      <w:r>
-        <w:t>Display your current USDC and POL balance</w:t>
-      </w:r>
-    </w:p>
-    <w:p>
-      <w:r>
-        <w:rPr>
-          <w:b/>
-          <w:color w:val="CC0000"/>
-        </w:rPr>
-        <w:t xml:space="preserve">Important: </w:t>
-      </w:r>
-      <w:r>
-        <w:t>You need at least 0.01 POL for gas fees and USDC.e for trading.</w:t>
-      </w:r>
-    </w:p>
-    <w:p>
-      <w:r>
-        <w:br w:type="page"/>
-      </w:r>
-    </w:p>
-    <w:p>
-      <w:pPr>
-        <w:pStyle w:val="Heading1"/>
-      </w:pPr>
-      <w:r>
-        <w:t>4. Running the Bot</w:t>
-      </w:r>
-    </w:p>
-    <w:p>
-      <w:r>
-        <w:t>Start the bot with:</w:t>
-      </w:r>
-    </w:p>
-    <w:p>
-      <w:pPr>
-        <w:pStyle w:val="NoSpacing"/>
-      </w:pPr>
-      <w:r>
-        <w:t>python -X utf8 bot.py</w:t>
-      </w:r>
-    </w:p>
-    <w:p/>
     <w:tbl>
       <w:tblPr>
-        <w:tblStyle w:val="LightList-Accent1"/>
+        <w:tblStyle w:val="TableGrid"/>
         <w:tblW w:type="auto" w:w="0"/>
         <w:tblLook w:firstColumn="1" w:firstRow="1" w:lastColumn="0" w:lastRow="0" w:noHBand="0" w:noVBand="1" w:val="04A0"/>
       </w:tblPr>
       <w:tblGrid>
-        <w:gridCol w:w="4703"/>
-        <w:gridCol w:w="4703"/>
+        <w:gridCol w:w="4320"/>
+        <w:gridCol w:w="4320"/>
       </w:tblGrid>
       <w:tr>
         <w:tc>
           <w:tcPr>
-            <w:tcW w:type="dxa" w:w="4703"/>
+            <w:tcW w:type="dxa" w:w="4320"/>
+          </w:tcPr>
+          <w:p/>
+        </w:tc>
+        <w:tc>
+          <w:tcPr>
+            <w:tcW w:type="dxa" w:w="4320"/>
+          </w:tcPr>
+          <w:p/>
+        </w:tc>
+      </w:tr>
+      <w:tr>
+        <w:tc>
+          <w:tcPr>
+            <w:tcW w:type="dxa" w:w="4320"/>
           </w:tcPr>
           <w:p>
             <w:r>
-              <w:t>Command</w:t>
+              <w:t>/auto up/down</w:t>
             </w:r>
           </w:p>
         </w:tc>
         <w:tc>
           <w:tcPr>
-            <w:tcW w:type="dxa" w:w="4703"/>
+            <w:tcW w:type="dxa" w:w="4320"/>
           </w:tcPr>
           <w:p>
             <w:r>
-              <w:t>Description</w:t>
+              <w:t>Enable auto-repeat. Bot will buy again whenever the previous market resolves.</w:t>
             </w:r>
           </w:p>
         </w:tc>
@@ -1034,21 +326,21 @@
       <w:tr>
         <w:tc>
           <w:tcPr>
-            <w:tcW w:type="dxa" w:w="4703"/>
+            <w:tcW w:type="dxa" w:w="4320"/>
           </w:tcPr>
           <w:p>
             <w:r>
-              <w:t>python bot.py</w:t>
+              <w:t>/auto off</w:t>
             </w:r>
           </w:p>
         </w:tc>
         <w:tc>
           <w:tcPr>
-            <w:tcW w:type="dxa" w:w="4703"/>
+            <w:tcW w:type="dxa" w:w="4320"/>
           </w:tcPr>
           <w:p>
             <w:r>
-              <w:t>Start in paper mode (default, no real money)</w:t>
+              <w:t>Disable auto-repeat.</w:t>
             </w:r>
           </w:p>
         </w:tc>
@@ -1056,21 +348,21 @@
       <w:tr>
         <w:tc>
           <w:tcPr>
-            <w:tcW w:type="dxa" w:w="4703"/>
+            <w:tcW w:type="dxa" w:w="4320"/>
           </w:tcPr>
           <w:p>
             <w:r>
-              <w:t>python bot.py --live</w:t>
+              <w:t>/schedule [HH:MM] [dir]</w:t>
             </w:r>
           </w:p>
         </w:tc>
         <w:tc>
           <w:tcPr>
-            <w:tcW w:type="dxa" w:w="4703"/>
+            <w:tcW w:type="dxa" w:w="4320"/>
           </w:tcPr>
           <w:p>
             <w:r>
-              <w:t>Start in live trading mode (real money)</w:t>
+              <w:t>Schedule a trade for a specific time (e.g., /schedule 14:30 up).</w:t>
             </w:r>
           </w:p>
         </w:tc>
@@ -1078,219 +370,21 @@
       <w:tr>
         <w:tc>
           <w:tcPr>
-            <w:tcW w:type="dxa" w:w="4703"/>
+            <w:tcW w:type="dxa" w:w="4320"/>
           </w:tcPr>
           <w:p>
             <w:r>
-              <w:t>python bot.py --status</w:t>
+              <w:t>/schedule off</w:t>
             </w:r>
           </w:p>
         </w:tc>
         <w:tc>
           <w:tcPr>
-            <w:tcW w:type="dxa" w:w="4703"/>
+            <w:tcW w:type="dxa" w:w="4320"/>
           </w:tcPr>
           <w:p>
             <w:r>
-              <w:t>Show current trade history and exit</w:t>
-            </w:r>
-          </w:p>
-        </w:tc>
-      </w:tr>
-    </w:tbl>
-    <w:p/>
-    <w:p>
-      <w:r>
-        <w:t>Once started, the bot will display initialization status and begin listening for Telegram commands. A status line is printed every 60 seconds showing the current BTC price, bot state, trade count, and P&amp;L.</w:t>
-      </w:r>
-    </w:p>
-    <w:p>
-      <w:r>
-        <w:t>Press Ctrl+C to stop the bot gracefully.</w:t>
-      </w:r>
-    </w:p>
-    <w:p>
-      <w:pPr>
-        <w:pStyle w:val="Heading1"/>
-      </w:pPr>
-      <w:r>
-        <w:t>5. Telegram Commands Reference</w:t>
-      </w:r>
-    </w:p>
-    <w:p>
-      <w:r>
-        <w:t>All bot operations are controlled via Telegram commands. Simply send the command as a message in your Telegram chat with the bot.</w:t>
-      </w:r>
-    </w:p>
-    <w:p>
-      <w:pPr>
-        <w:pStyle w:val="Heading2"/>
-      </w:pPr>
-      <w:r>
-        <w:t>5.1 BTC Trading Commands</w:t>
-      </w:r>
-    </w:p>
-    <w:tbl>
-      <w:tblPr>
-        <w:tblStyle w:val="LightList-Accent1"/>
-        <w:tblW w:type="auto" w:w="0"/>
-        <w:jc w:val="center"/>
-        <w:tblLook w:firstColumn="1" w:firstRow="1" w:lastColumn="0" w:lastRow="0" w:noHBand="0" w:noVBand="1" w:val="04A0"/>
-      </w:tblPr>
-      <w:tblGrid>
-        <w:gridCol w:w="4703"/>
-        <w:gridCol w:w="4703"/>
-      </w:tblGrid>
-      <w:tr>
-        <w:tc>
-          <w:tcPr>
-            <w:tcW w:type="dxa" w:w="2835"/>
-          </w:tcPr>
-          <w:p>
-            <w:r>
-              <w:t>Command</w:t>
-            </w:r>
-          </w:p>
-        </w:tc>
-        <w:tc>
-          <w:tcPr>
-            <w:tcW w:type="dxa" w:w="6803"/>
-          </w:tcPr>
-          <w:p>
-            <w:r>
-              <w:t>Description</w:t>
-            </w:r>
-          </w:p>
-        </w:tc>
-      </w:tr>
-      <w:tr>
-        <w:tc>
-          <w:tcPr>
-            <w:tcW w:type="dxa" w:w="2835"/>
-          </w:tcPr>
-          <w:p>
-            <w:r>
-              <w:t>/buy up</w:t>
-            </w:r>
-          </w:p>
-        </w:tc>
-        <w:tc>
-          <w:tcPr>
-            <w:tcW w:type="dxa" w:w="6803"/>
-          </w:tcPr>
-          <w:p>
-            <w:r>
-              <w:t>Buy UP tokens (bet BTC will rise)</w:t>
-            </w:r>
-          </w:p>
-        </w:tc>
-      </w:tr>
-      <w:tr>
-        <w:tc>
-          <w:tcPr>
-            <w:tcW w:type="dxa" w:w="2835"/>
-          </w:tcPr>
-          <w:p>
-            <w:r>
-              <w:t>/buy down</w:t>
-            </w:r>
-          </w:p>
-        </w:tc>
-        <w:tc>
-          <w:tcPr>
-            <w:tcW w:type="dxa" w:w="6803"/>
-          </w:tcPr>
-          <w:p>
-            <w:r>
-              <w:t>Buy DOWN tokens (bet BTC will fall)</w:t>
-            </w:r>
-          </w:p>
-        </w:tc>
-      </w:tr>
-      <w:tr>
-        <w:tc>
-          <w:tcPr>
-            <w:tcW w:type="dxa" w:w="2835"/>
-          </w:tcPr>
-          <w:p>
-            <w:r>
-              <w:t>/buy up 5m</w:t>
-            </w:r>
-          </w:p>
-        </w:tc>
-        <w:tc>
-          <w:tcPr>
-            <w:tcW w:type="dxa" w:w="6803"/>
-          </w:tcPr>
-          <w:p>
-            <w:r>
-              <w:t>Buy UP on 5-minute market</w:t>
-            </w:r>
-          </w:p>
-        </w:tc>
-      </w:tr>
-      <w:tr>
-        <w:tc>
-          <w:tcPr>
-            <w:tcW w:type="dxa" w:w="2835"/>
-          </w:tcPr>
-          <w:p>
-            <w:r>
-              <w:t>/buy up 15m</w:t>
-            </w:r>
-          </w:p>
-        </w:tc>
-        <w:tc>
-          <w:tcPr>
-            <w:tcW w:type="dxa" w:w="6803"/>
-          </w:tcPr>
-          <w:p>
-            <w:r>
-              <w:t>Buy UP on 15-minute market</w:t>
-            </w:r>
-          </w:p>
-        </w:tc>
-      </w:tr>
-      <w:tr>
-        <w:tc>
-          <w:tcPr>
-            <w:tcW w:type="dxa" w:w="2835"/>
-          </w:tcPr>
-          <w:p>
-            <w:r>
-              <w:t>/buy down 1h</w:t>
-            </w:r>
-          </w:p>
-        </w:tc>
-        <w:tc>
-          <w:tcPr>
-            <w:tcW w:type="dxa" w:w="6803"/>
-          </w:tcPr>
-          <w:p>
-            <w:r>
-              <w:t>Buy DOWN on 1-hour market</w:t>
-            </w:r>
-          </w:p>
-        </w:tc>
-      </w:tr>
-      <w:tr>
-        <w:tc>
-          <w:tcPr>
-            <w:tcW w:type="dxa" w:w="2835"/>
-          </w:tcPr>
-          <w:p>
-            <w:r>
-              <w:t>/sell</w:t>
-            </w:r>
-          </w:p>
-        </w:tc>
-        <w:tc>
-          <w:tcPr>
-            <w:tcW w:type="dxa" w:w="6803"/>
-          </w:tcPr>
-          <w:p>
-            <w:r>
-              <w:t>Close/sell current open position</w:t>
+              <w:t>Cancel the pending scheduled trade.</w:t>
             </w:r>
           </w:p>
         </w:tc>
@@ -1301,43 +395,51 @@
         <w:pStyle w:val="Heading2"/>
       </w:pPr>
       <w:r>
-        <w:t>5.2 Custom Market Commands</w:t>
-      </w:r>
-    </w:p>
-    <w:p>
-      <w:r>
-        <w:t>You can trade on ANY Polymarket event, not just BTC. First search for a market, then trade on it:</w:t>
+        <w:t>📊 Logging &amp; Analytics</w:t>
       </w:r>
     </w:p>
     <w:tbl>
       <w:tblPr>
-        <w:tblStyle w:val="LightList-Accent1"/>
+        <w:tblStyle w:val="TableGrid"/>
         <w:tblW w:type="auto" w:w="0"/>
-        <w:jc w:val="center"/>
         <w:tblLook w:firstColumn="1" w:firstRow="1" w:lastColumn="0" w:lastRow="0" w:noHBand="0" w:noVBand="1" w:val="04A0"/>
       </w:tblPr>
       <w:tblGrid>
-        <w:gridCol w:w="4703"/>
-        <w:gridCol w:w="4703"/>
+        <w:gridCol w:w="4320"/>
+        <w:gridCol w:w="4320"/>
       </w:tblGrid>
       <w:tr>
         <w:tc>
           <w:tcPr>
-            <w:tcW w:type="dxa" w:w="2835"/>
+            <w:tcW w:type="dxa" w:w="4320"/>
+          </w:tcPr>
+          <w:p/>
+        </w:tc>
+        <w:tc>
+          <w:tcPr>
+            <w:tcW w:type="dxa" w:w="4320"/>
+          </w:tcPr>
+          <w:p/>
+        </w:tc>
+      </w:tr>
+      <w:tr>
+        <w:tc>
+          <w:tcPr>
+            <w:tcW w:type="dxa" w:w="4320"/>
           </w:tcPr>
           <w:p>
             <w:r>
-              <w:t>Command</w:t>
+              <w:t>/history [period]</w:t>
             </w:r>
           </w:p>
         </w:tc>
         <w:tc>
           <w:tcPr>
-            <w:tcW w:type="dxa" w:w="6803"/>
+            <w:tcW w:type="dxa" w:w="4320"/>
           </w:tcPr>
           <w:p>
             <w:r>
-              <w:t>Description</w:t>
+              <w:t>View trade stats for a period (e.g., /history today, 7d, 1y, 2024).</w:t>
             </w:r>
           </w:p>
         </w:tc>
@@ -1345,21 +447,21 @@
       <w:tr>
         <w:tc>
           <w:tcPr>
-            <w:tcW w:type="dxa" w:w="2835"/>
+            <w:tcW w:type="dxa" w:w="4320"/>
           </w:tcPr>
           <w:p>
             <w:r>
-              <w:t>/search bitcoin</w:t>
+              <w:t>/backtest run</w:t>
             </w:r>
           </w:p>
         </w:tc>
         <w:tc>
           <w:tcPr>
-            <w:tcW w:type="dxa" w:w="6803"/>
+            <w:tcW w:type="dxa" w:w="4320"/>
           </w:tcPr>
           <w:p>
             <w:r>
-              <w:t>Search for Bitcoin-related markets</w:t>
+              <w:t>Simulate trades using your history and save to backtest_log.xlsx.</w:t>
             </w:r>
           </w:p>
         </w:tc>
@@ -1367,21 +469,21 @@
       <w:tr>
         <w:tc>
           <w:tcPr>
-            <w:tcW w:type="dxa" w:w="2835"/>
+            <w:tcW w:type="dxa" w:w="4320"/>
           </w:tcPr>
           <w:p>
             <w:r>
-              <w:t>/search trump</w:t>
+              <w:t>/backtest results</w:t>
             </w:r>
           </w:p>
         </w:tc>
         <w:tc>
           <w:tcPr>
-            <w:tcW w:type="dxa" w:w="6803"/>
+            <w:tcW w:type="dxa" w:w="4320"/>
           </w:tcPr>
           <w:p>
             <w:r>
-              <w:t>Search for Trump-related markets</w:t>
+              <w:t>Quick summary of the last backtest (ROI, Drawdown, Profit Factor).</w:t>
             </w:r>
           </w:p>
         </w:tc>
@@ -1389,21 +491,21 @@
       <w:tr>
         <w:tc>
           <w:tcPr>
-            <w:tcW w:type="dxa" w:w="2835"/>
+            <w:tcW w:type="dxa" w:w="4320"/>
           </w:tcPr>
           <w:p>
             <w:r>
-              <w:t>/search nba</w:t>
+              <w:t>/export live</w:t>
             </w:r>
           </w:p>
         </w:tc>
         <w:tc>
           <w:tcPr>
-            <w:tcW w:type="dxa" w:w="6803"/>
+            <w:tcW w:type="dxa" w:w="4320"/>
           </w:tcPr>
           <w:p>
             <w:r>
-              <w:t>Search for NBA markets</w:t>
+              <w:t>Download the 'trade_log.xlsx' file directly in Telegram.</w:t>
             </w:r>
           </w:p>
         </w:tc>
@@ -1411,21 +513,21 @@
       <w:tr>
         <w:tc>
           <w:tcPr>
-            <w:tcW w:type="dxa" w:w="2835"/>
+            <w:tcW w:type="dxa" w:w="4320"/>
           </w:tcPr>
           <w:p>
             <w:r>
-              <w:t>/search election</w:t>
+              <w:t>/export backtest</w:t>
             </w:r>
           </w:p>
         </w:tc>
         <w:tc>
           <w:tcPr>
-            <w:tcW w:type="dxa" w:w="6803"/>
+            <w:tcW w:type="dxa" w:w="4320"/>
           </w:tcPr>
           <w:p>
             <w:r>
-              <w:t>Search for election markets</w:t>
+              <w:t>Download the 'backtest_log.xlsx' file directly in Telegram.</w:t>
             </w:r>
           </w:p>
         </w:tc>
@@ -1433,21 +535,21 @@
       <w:tr>
         <w:tc>
           <w:tcPr>
-            <w:tcW w:type="dxa" w:w="2835"/>
+            <w:tcW w:type="dxa" w:w="4320"/>
           </w:tcPr>
           <w:p>
             <w:r>
-              <w:t>/trending</w:t>
+              <w:t>/pnl</w:t>
             </w:r>
           </w:p>
         </w:tc>
         <w:tc>
           <w:tcPr>
-            <w:tcW w:type="dxa" w:w="6803"/>
+            <w:tcW w:type="dxa" w:w="4320"/>
           </w:tcPr>
           <w:p>
             <w:r>
-              <w:t>Show trending/popular markets</w:t>
+              <w:t>Summary of current profit and loss.</w:t>
             </w:r>
           </w:p>
         </w:tc>
@@ -1455,65 +557,21 @@
       <w:tr>
         <w:tc>
           <w:tcPr>
-            <w:tcW w:type="dxa" w:w="2835"/>
+            <w:tcW w:type="dxa" w:w="4320"/>
           </w:tcPr>
           <w:p>
             <w:r>
-              <w:t>/trade 1 yes</w:t>
+              <w:t>/trades</w:t>
             </w:r>
           </w:p>
         </w:tc>
         <w:tc>
           <w:tcPr>
-            <w:tcW w:type="dxa" w:w="6803"/>
+            <w:tcW w:type="dxa" w:w="4320"/>
           </w:tcPr>
           <w:p>
             <w:r>
-              <w:t>Buy "Yes" on search result #1</w:t>
-            </w:r>
-          </w:p>
-        </w:tc>
-      </w:tr>
-      <w:tr>
-        <w:tc>
-          <w:tcPr>
-            <w:tcW w:type="dxa" w:w="2835"/>
-          </w:tcPr>
-          <w:p>
-            <w:r>
-              <w:t>/trade 1 no</w:t>
-            </w:r>
-          </w:p>
-        </w:tc>
-        <w:tc>
-          <w:tcPr>
-            <w:tcW w:type="dxa" w:w="6803"/>
-          </w:tcPr>
-          <w:p>
-            <w:r>
-              <w:t>Buy "No" on search result #1</w:t>
-            </w:r>
-          </w:p>
-        </w:tc>
-      </w:tr>
-      <w:tr>
-        <w:tc>
-          <w:tcPr>
-            <w:tcW w:type="dxa" w:w="2835"/>
-          </w:tcPr>
-          <w:p>
-            <w:r>
-              <w:t>/trade 3 yes</w:t>
-            </w:r>
-          </w:p>
-        </w:tc>
-        <w:tc>
-          <w:tcPr>
-            <w:tcW w:type="dxa" w:w="6803"/>
-          </w:tcPr>
-          <w:p>
-            <w:r>
-              <w:t>Buy "Yes" on search result #3</w:t>
+              <w:t>List of current and most recent trades.</w:t>
             </w:r>
           </w:p>
         </w:tc>
@@ -1524,43 +582,51 @@
         <w:pStyle w:val="Heading2"/>
       </w:pPr>
       <w:r>
-        <w:t>5.3 Auto-Repeat Commands</w:t>
-      </w:r>
-    </w:p>
-    <w:p>
-      <w:r>
-        <w:t>Auto-repeat automatically places the same trade direction on each new market after the previous one resolves:</w:t>
+        <w:t>⚙️ Settings (/set command)</w:t>
       </w:r>
     </w:p>
     <w:tbl>
       <w:tblPr>
-        <w:tblStyle w:val="LightList-Accent1"/>
+        <w:tblStyle w:val="TableGrid"/>
         <w:tblW w:type="auto" w:w="0"/>
-        <w:jc w:val="center"/>
         <w:tblLook w:firstColumn="1" w:firstRow="1" w:lastColumn="0" w:lastRow="0" w:noHBand="0" w:noVBand="1" w:val="04A0"/>
       </w:tblPr>
       <w:tblGrid>
-        <w:gridCol w:w="4703"/>
-        <w:gridCol w:w="4703"/>
+        <w:gridCol w:w="4320"/>
+        <w:gridCol w:w="4320"/>
       </w:tblGrid>
       <w:tr>
         <w:tc>
           <w:tcPr>
-            <w:tcW w:type="dxa" w:w="2835"/>
+            <w:tcW w:type="dxa" w:w="4320"/>
+          </w:tcPr>
+          <w:p/>
+        </w:tc>
+        <w:tc>
+          <w:tcPr>
+            <w:tcW w:type="dxa" w:w="4320"/>
+          </w:tcPr>
+          <w:p/>
+        </w:tc>
+      </w:tr>
+      <w:tr>
+        <w:tc>
+          <w:tcPr>
+            <w:tcW w:type="dxa" w:w="4320"/>
           </w:tcPr>
           <w:p>
             <w:r>
-              <w:t>Command</w:t>
+              <w:t>/set tp [90]</w:t>
             </w:r>
           </w:p>
         </w:tc>
         <w:tc>
           <w:tcPr>
-            <w:tcW w:type="dxa" w:w="6803"/>
+            <w:tcW w:type="dxa" w:w="4320"/>
           </w:tcPr>
           <w:p>
             <w:r>
-              <w:t>Description</w:t>
+              <w:t>Set Take-Profit percentage.</w:t>
             </w:r>
           </w:p>
         </w:tc>
@@ -1568,21 +634,21 @@
       <w:tr>
         <w:tc>
           <w:tcPr>
-            <w:tcW w:type="dxa" w:w="2835"/>
+            <w:tcW w:type="dxa" w:w="4320"/>
           </w:tcPr>
           <w:p>
             <w:r>
-              <w:t>/auto up</w:t>
+              <w:t>/set sl [30]</w:t>
             </w:r>
           </w:p>
         </w:tc>
         <w:tc>
           <w:tcPr>
-            <w:tcW w:type="dxa" w:w="6803"/>
+            <w:tcW w:type="dxa" w:w="4320"/>
           </w:tcPr>
           <w:p>
             <w:r>
-              <w:t>Auto-repeat buying UP on each new market</w:t>
+              <w:t>Set Stop-Loss percentage.</w:t>
             </w:r>
           </w:p>
         </w:tc>
@@ -1590,21 +656,21 @@
       <w:tr>
         <w:tc>
           <w:tcPr>
-            <w:tcW w:type="dxa" w:w="2835"/>
+            <w:tcW w:type="dxa" w:w="4320"/>
           </w:tcPr>
           <w:p>
             <w:r>
-              <w:t>/auto down</w:t>
+              <w:t>/set amount [10]</w:t>
             </w:r>
           </w:p>
         </w:tc>
         <w:tc>
           <w:tcPr>
-            <w:tcW w:type="dxa" w:w="6803"/>
+            <w:tcW w:type="dxa" w:w="4320"/>
           </w:tcPr>
           <w:p>
             <w:r>
-              <w:t>Auto-repeat buying DOWN on each new market</w:t>
+              <w:t>Set fixed trade amount in USDC.</w:t>
             </w:r>
           </w:p>
         </w:tc>
@@ -1612,63 +678,21 @@
       <w:tr>
         <w:tc>
           <w:tcPr>
-            <w:tcW w:type="dxa" w:w="2835"/>
+            <w:tcW w:type="dxa" w:w="4320"/>
           </w:tcPr>
           <w:p>
             <w:r>
-              <w:t>/auto off</w:t>
+              <w:t>/set slippage [0.05]</w:t>
             </w:r>
           </w:p>
         </w:tc>
         <w:tc>
           <w:tcPr>
-            <w:tcW w:type="dxa" w:w="6803"/>
+            <w:tcW w:type="dxa" w:w="4320"/>
           </w:tcPr>
           <w:p>
             <w:r>
-              <w:t>Turn off auto-repeat</w:t>
-            </w:r>
-          </w:p>
-        </w:tc>
-      </w:tr>
-    </w:tbl>
-    <w:p>
-      <w:pPr>
-        <w:pStyle w:val="Heading2"/>
-      </w:pPr>
-      <w:r>
-        <w:t>5.4 Status &amp; Info Commands</w:t>
-      </w:r>
-    </w:p>
-    <w:tbl>
-      <w:tblPr>
-        <w:tblStyle w:val="LightList-Accent1"/>
-        <w:tblW w:type="auto" w:w="0"/>
-        <w:jc w:val="center"/>
-        <w:tblLook w:firstColumn="1" w:firstRow="1" w:lastColumn="0" w:lastRow="0" w:noHBand="0" w:noVBand="1" w:val="04A0"/>
-      </w:tblPr>
-      <w:tblGrid>
-        <w:gridCol w:w="4703"/>
-        <w:gridCol w:w="4703"/>
-      </w:tblGrid>
-      <w:tr>
-        <w:tc>
-          <w:tcPr>
-            <w:tcW w:type="dxa" w:w="2835"/>
-          </w:tcPr>
-          <w:p>
-            <w:r>
-              <w:t>Command</w:t>
-            </w:r>
-          </w:p>
-        </w:tc>
-        <w:tc>
-          <w:tcPr>
-            <w:tcW w:type="dxa" w:w="6803"/>
-          </w:tcPr>
-          <w:p>
-            <w:r>
-              <w:t>Description</w:t>
+              <w:t>Set maximum allowed slippage.</w:t>
             </w:r>
           </w:p>
         </w:tc>
@@ -1676,1524 +700,21 @@
       <w:tr>
         <w:tc>
           <w:tcPr>
-            <w:tcW w:type="dxa" w:w="2835"/>
+            <w:tcW w:type="dxa" w:w="4320"/>
           </w:tcPr>
           <w:p>
             <w:r>
-              <w:t>/status</w:t>
+              <w:t>/set market [5m,15m]</w:t>
             </w:r>
           </w:p>
         </w:tc>
         <w:tc>
           <w:tcPr>
-            <w:tcW w:type="dxa" w:w="6803"/>
+            <w:tcW w:type="dxa" w:w="4320"/>
           </w:tcPr>
           <w:p>
             <w:r>
-              <w:t>Bot status, open positions, daily P&amp;L</w:t>
-            </w:r>
-          </w:p>
-        </w:tc>
-      </w:tr>
-      <w:tr>
-        <w:tc>
-          <w:tcPr>
-            <w:tcW w:type="dxa" w:w="2835"/>
-          </w:tcPr>
-          <w:p>
-            <w:r>
-              <w:t>/config</w:t>
-            </w:r>
-          </w:p>
-        </w:tc>
-        <w:tc>
-          <w:tcPr>
-            <w:tcW w:type="dxa" w:w="6803"/>
-          </w:tcPr>
-          <w:p>
-            <w:r>
-              <w:t>Show all current parameter settings</w:t>
-            </w:r>
-          </w:p>
-        </w:tc>
-      </w:tr>
-      <w:tr>
-        <w:tc>
-          <w:tcPr>
-            <w:tcW w:type="dxa" w:w="2835"/>
-          </w:tcPr>
-          <w:p>
-            <w:r>
-              <w:t>/pnl</w:t>
-            </w:r>
-          </w:p>
-        </w:tc>
-        <w:tc>
-          <w:tcPr>
-            <w:tcW w:type="dxa" w:w="6803"/>
-          </w:tcPr>
-          <w:p>
-            <w:r>
-              <w:t>Profit &amp; Loss summary (daily + all time)</w:t>
-            </w:r>
-          </w:p>
-        </w:tc>
-      </w:tr>
-      <w:tr>
-        <w:tc>
-          <w:tcPr>
-            <w:tcW w:type="dxa" w:w="2835"/>
-          </w:tcPr>
-          <w:p>
-            <w:r>
-              <w:t>/trades</w:t>
-            </w:r>
-          </w:p>
-        </w:tc>
-        <w:tc>
-          <w:tcPr>
-            <w:tcW w:type="dxa" w:w="6803"/>
-          </w:tcPr>
-          <w:p>
-            <w:r>
-              <w:t>Recent trade history (last 10 trades)</w:t>
-            </w:r>
-          </w:p>
-        </w:tc>
-      </w:tr>
-      <w:tr>
-        <w:tc>
-          <w:tcPr>
-            <w:tcW w:type="dxa" w:w="2835"/>
-          </w:tcPr>
-          <w:p>
-            <w:r>
-              <w:t>/markets</w:t>
-            </w:r>
-          </w:p>
-        </w:tc>
-        <w:tc>
-          <w:tcPr>
-            <w:tcW w:type="dxa" w:w="6803"/>
-          </w:tcPr>
-          <w:p>
-            <w:r>
-              <w:t>Available BTC UP/DOWN markets</w:t>
-            </w:r>
-          </w:p>
-        </w:tc>
-      </w:tr>
-      <w:tr>
-        <w:tc>
-          <w:tcPr>
-            <w:tcW w:type="dxa" w:w="2835"/>
-          </w:tcPr>
-          <w:p>
-            <w:r>
-              <w:t>/balance</w:t>
-            </w:r>
-          </w:p>
-        </w:tc>
-        <w:tc>
-          <w:tcPr>
-            <w:tcW w:type="dxa" w:w="6803"/>
-          </w:tcPr>
-          <w:p>
-            <w:r>
-              <w:t>Wallet balance (USDC + POL)</w:t>
-            </w:r>
-          </w:p>
-        </w:tc>
-      </w:tr>
-    </w:tbl>
-    <w:p>
-      <w:pPr>
-        <w:pStyle w:val="Heading2"/>
-      </w:pPr>
-      <w:r>
-        <w:t>5.5 Settings Commands</w:t>
-      </w:r>
-    </w:p>
-    <w:p>
-      <w:r>
-        <w:t>All trading parameters can be changed in real-time without restarting the bot:</w:t>
-      </w:r>
-    </w:p>
-    <w:tbl>
-      <w:tblPr>
-        <w:tblStyle w:val="LightList-Accent1"/>
-        <w:tblW w:type="auto" w:w="0"/>
-        <w:jc w:val="center"/>
-        <w:tblLook w:firstColumn="1" w:firstRow="1" w:lastColumn="0" w:lastRow="0" w:noHBand="0" w:noVBand="1" w:val="04A0"/>
-      </w:tblPr>
-      <w:tblGrid>
-        <w:gridCol w:w="3135"/>
-        <w:gridCol w:w="3135"/>
-        <w:gridCol w:w="3135"/>
-      </w:tblGrid>
-      <w:tr>
-        <w:tc>
-          <w:tcPr>
-            <w:tcW w:type="dxa" w:w="3135"/>
-          </w:tcPr>
-          <w:p>
-            <w:r>
-              <w:t>Command</w:t>
-            </w:r>
-          </w:p>
-        </w:tc>
-        <w:tc>
-          <w:tcPr>
-            <w:tcW w:type="dxa" w:w="3135"/>
-          </w:tcPr>
-          <w:p>
-            <w:r>
-              <w:t>Default</w:t>
-            </w:r>
-          </w:p>
-        </w:tc>
-        <w:tc>
-          <w:tcPr>
-            <w:tcW w:type="dxa" w:w="3135"/>
-          </w:tcPr>
-          <w:p>
-            <w:r>
-              <w:t>Description</w:t>
-            </w:r>
-          </w:p>
-        </w:tc>
-      </w:tr>
-      <w:tr>
-        <w:tc>
-          <w:tcPr>
-            <w:tcW w:type="dxa" w:w="3135"/>
-          </w:tcPr>
-          <w:p>
-            <w:r>
-              <w:t>/set tp 90</w:t>
-            </w:r>
-          </w:p>
-        </w:tc>
-        <w:tc>
-          <w:tcPr>
-            <w:tcW w:type="dxa" w:w="3135"/>
-          </w:tcPr>
-          <w:p>
-            <w:r>
-              <w:t>80%</w:t>
-            </w:r>
-          </w:p>
-        </w:tc>
-        <w:tc>
-          <w:tcPr>
-            <w:tcW w:type="dxa" w:w="3135"/>
-          </w:tcPr>
-          <w:p>
-            <w:r>
-              <w:t>Take-profit percentage</w:t>
-            </w:r>
-          </w:p>
-        </w:tc>
-      </w:tr>
-      <w:tr>
-        <w:tc>
-          <w:tcPr>
-            <w:tcW w:type="dxa" w:w="3135"/>
-          </w:tcPr>
-          <w:p>
-            <w:r>
-              <w:t>/set sl 30</w:t>
-            </w:r>
-          </w:p>
-        </w:tc>
-        <w:tc>
-          <w:tcPr>
-            <w:tcW w:type="dxa" w:w="3135"/>
-          </w:tcPr>
-          <w:p>
-            <w:r>
-              <w:t>50%</w:t>
-            </w:r>
-          </w:p>
-        </w:tc>
-        <w:tc>
-          <w:tcPr>
-            <w:tcW w:type="dxa" w:w="3135"/>
-          </w:tcPr>
-          <w:p>
-            <w:r>
-              <w:t>Stop-loss percentage</w:t>
-            </w:r>
-          </w:p>
-        </w:tc>
-      </w:tr>
-      <w:tr>
-        <w:tc>
-          <w:tcPr>
-            <w:tcW w:type="dxa" w:w="3135"/>
-          </w:tcPr>
-          <w:p>
-            <w:r>
-              <w:t>/set amount 10</w:t>
-            </w:r>
-          </w:p>
-        </w:tc>
-        <w:tc>
-          <w:tcPr>
-            <w:tcW w:type="dxa" w:w="3135"/>
-          </w:tcPr>
-          <w:p>
-            <w:r>
-              <w:t>$5.00</w:t>
-            </w:r>
-          </w:p>
-        </w:tc>
-        <w:tc>
-          <w:tcPr>
-            <w:tcW w:type="dxa" w:w="3135"/>
-          </w:tcPr>
-          <w:p>
-            <w:r>
-              <w:t>Trade amount in USDC</w:t>
-            </w:r>
-          </w:p>
-        </w:tc>
-      </w:tr>
-      <w:tr>
-        <w:tc>
-          <w:tcPr>
-            <w:tcW w:type="dxa" w:w="3135"/>
-          </w:tcPr>
-          <w:p>
-            <w:r>
-              <w:t>/set percent 5</w:t>
-            </w:r>
-          </w:p>
-        </w:tc>
-        <w:tc>
-          <w:tcPr>
-            <w:tcW w:type="dxa" w:w="3135"/>
-          </w:tcPr>
-          <w:p>
-            <w:r>
-              <w:t>5%</w:t>
-            </w:r>
-          </w:p>
-        </w:tc>
-        <w:tc>
-          <w:tcPr>
-            <w:tcW w:type="dxa" w:w="3135"/>
-          </w:tcPr>
-          <w:p>
-            <w:r>
-              <w:t>Portfolio % per trade</w:t>
-            </w:r>
-          </w:p>
-        </w:tc>
-      </w:tr>
-      <w:tr>
-        <w:tc>
-          <w:tcPr>
-            <w:tcW w:type="dxa" w:w="3135"/>
-          </w:tcPr>
-          <w:p>
-            <w:r>
-              <w:t>/set size fixed</w:t>
-            </w:r>
-          </w:p>
-        </w:tc>
-        <w:tc>
-          <w:tcPr>
-            <w:tcW w:type="dxa" w:w="3135"/>
-          </w:tcPr>
-          <w:p>
-            <w:r>
-              <w:t>fixed</w:t>
-            </w:r>
-          </w:p>
-        </w:tc>
-        <w:tc>
-          <w:tcPr>
-            <w:tcW w:type="dxa" w:w="3135"/>
-          </w:tcPr>
-          <w:p>
-            <w:r>
-              <w:t>Sizing mode: fixed or percent</w:t>
-            </w:r>
-          </w:p>
-        </w:tc>
-      </w:tr>
-      <w:tr>
-        <w:tc>
-          <w:tcPr>
-            <w:tcW w:type="dxa" w:w="3135"/>
-          </w:tcPr>
-          <w:p>
-            <w:r>
-              <w:t>/set slippage 0.05</w:t>
-            </w:r>
-          </w:p>
-        </w:tc>
-        <w:tc>
-          <w:tcPr>
-            <w:tcW w:type="dxa" w:w="3135"/>
-          </w:tcPr>
-          <w:p>
-            <w:r>
-              <w:t>$0.05</w:t>
-            </w:r>
-          </w:p>
-        </w:tc>
-        <w:tc>
-          <w:tcPr>
-            <w:tcW w:type="dxa" w:w="3135"/>
-          </w:tcPr>
-          <w:p>
-            <w:r>
-              <w:t>Maximum slippage allowed</w:t>
-            </w:r>
-          </w:p>
-        </w:tc>
-      </w:tr>
-      <w:tr>
-        <w:tc>
-          <w:tcPr>
-            <w:tcW w:type="dxa" w:w="3135"/>
-          </w:tcPr>
-          <w:p>
-            <w:r>
-              <w:t>/set shareprice 0.50</w:t>
-            </w:r>
-          </w:p>
-        </w:tc>
-        <w:tc>
-          <w:tcPr>
-            <w:tcW w:type="dxa" w:w="3135"/>
-          </w:tcPr>
-          <w:p>
-            <w:r>
-              <w:t>$0.50</w:t>
-            </w:r>
-          </w:p>
-        </w:tc>
-        <w:tc>
-          <w:tcPr>
-            <w:tcW w:type="dxa" w:w="3135"/>
-          </w:tcPr>
-          <w:p>
-            <w:r>
-              <w:t>Target share price</w:t>
-            </w:r>
-          </w:p>
-        </w:tc>
-      </w:tr>
-      <w:tr>
-        <w:tc>
-          <w:tcPr>
-            <w:tcW w:type="dxa" w:w="3135"/>
-          </w:tcPr>
-          <w:p>
-            <w:r>
-              <w:t>/set market 5m,15m</w:t>
-            </w:r>
-          </w:p>
-        </w:tc>
-        <w:tc>
-          <w:tcPr>
-            <w:tcW w:type="dxa" w:w="3135"/>
-          </w:tcPr>
-          <w:p>
-            <w:r>
-              <w:t>15m</w:t>
-            </w:r>
-          </w:p>
-        </w:tc>
-        <w:tc>
-          <w:tcPr>
-            <w:tcW w:type="dxa" w:w="3135"/>
-          </w:tcPr>
-          <w:p>
-            <w:r>
-              <w:t>Market timeframes to trade</w:t>
-            </w:r>
-          </w:p>
-        </w:tc>
-      </w:tr>
-      <w:tr>
-        <w:tc>
-          <w:tcPr>
-            <w:tcW w:type="dxa" w:w="3135"/>
-          </w:tcPr>
-          <w:p>
-            <w:r>
-              <w:t>/set maxtrades 50</w:t>
-            </w:r>
-          </w:p>
-        </w:tc>
-        <w:tc>
-          <w:tcPr>
-            <w:tcW w:type="dxa" w:w="3135"/>
-          </w:tcPr>
-          <w:p>
-            <w:r>
-              <w:t>50</w:t>
-            </w:r>
-          </w:p>
-        </w:tc>
-        <w:tc>
-          <w:tcPr>
-            <w:tcW w:type="dxa" w:w="3135"/>
-          </w:tcPr>
-          <w:p>
-            <w:r>
-              <w:t>Maximum trades per day</w:t>
-            </w:r>
-          </w:p>
-        </w:tc>
-      </w:tr>
-      <w:tr>
-        <w:tc>
-          <w:tcPr>
-            <w:tcW w:type="dxa" w:w="3135"/>
-          </w:tcPr>
-          <w:p>
-            <w:r>
-              <w:t>/set cooldown 30</w:t>
-            </w:r>
-          </w:p>
-        </w:tc>
-        <w:tc>
-          <w:tcPr>
-            <w:tcW w:type="dxa" w:w="3135"/>
-          </w:tcPr>
-          <w:p>
-            <w:r>
-              <w:t>30</w:t>
-            </w:r>
-          </w:p>
-        </w:tc>
-        <w:tc>
-          <w:tcPr>
-            <w:tcW w:type="dxa" w:w="3135"/>
-          </w:tcPr>
-          <w:p>
-            <w:r>
-              <w:t>Cooldown between trades (min)</w:t>
-            </w:r>
-          </w:p>
-        </w:tc>
-      </w:tr>
-      <w:tr>
-        <w:tc>
-          <w:tcPr>
-            <w:tcW w:type="dxa" w:w="3135"/>
-          </w:tcPr>
-          <w:p>
-            <w:r>
-              <w:t>/set tick 5</w:t>
-            </w:r>
-          </w:p>
-        </w:tc>
-        <w:tc>
-          <w:tcPr>
-            <w:tcW w:type="dxa" w:w="3135"/>
-          </w:tcPr>
-          <w:p>
-            <w:r>
-              <w:t>5</w:t>
-            </w:r>
-          </w:p>
-        </w:tc>
-        <w:tc>
-          <w:tcPr>
-            <w:tcW w:type="dxa" w:w="3135"/>
-          </w:tcPr>
-          <w:p>
-            <w:r>
-              <w:t>Price check interval (seconds)</w:t>
-            </w:r>
-          </w:p>
-        </w:tc>
-      </w:tr>
-    </w:tbl>
-    <w:p>
-      <w:pPr>
-        <w:pStyle w:val="Heading2"/>
-      </w:pPr>
-      <w:r>
-        <w:t>5.6 Control Commands</w:t>
-      </w:r>
-    </w:p>
-    <w:tbl>
-      <w:tblPr>
-        <w:tblStyle w:val="LightList-Accent1"/>
-        <w:tblW w:type="auto" w:w="0"/>
-        <w:jc w:val="center"/>
-        <w:tblLook w:firstColumn="1" w:firstRow="1" w:lastColumn="0" w:lastRow="0" w:noHBand="0" w:noVBand="1" w:val="04A0"/>
-      </w:tblPr>
-      <w:tblGrid>
-        <w:gridCol w:w="4703"/>
-        <w:gridCol w:w="4703"/>
-      </w:tblGrid>
-      <w:tr>
-        <w:tc>
-          <w:tcPr>
-            <w:tcW w:type="dxa" w:w="2835"/>
-          </w:tcPr>
-          <w:p>
-            <w:r>
-              <w:t>Command</w:t>
-            </w:r>
-          </w:p>
-        </w:tc>
-        <w:tc>
-          <w:tcPr>
-            <w:tcW w:type="dxa" w:w="6803"/>
-          </w:tcPr>
-          <w:p>
-            <w:r>
-              <w:t>Description</w:t>
-            </w:r>
-          </w:p>
-        </w:tc>
-      </w:tr>
-      <w:tr>
-        <w:tc>
-          <w:tcPr>
-            <w:tcW w:type="dxa" w:w="2835"/>
-          </w:tcPr>
-          <w:p>
-            <w:r>
-              <w:t>/start</w:t>
-            </w:r>
-          </w:p>
-        </w:tc>
-        <w:tc>
-          <w:tcPr>
-            <w:tcW w:type="dxa" w:w="6803"/>
-          </w:tcPr>
-          <w:p>
-            <w:r>
-              <w:t>Resume the bot after pausing</w:t>
-            </w:r>
-          </w:p>
-        </w:tc>
-      </w:tr>
-      <w:tr>
-        <w:tc>
-          <w:tcPr>
-            <w:tcW w:type="dxa" w:w="2835"/>
-          </w:tcPr>
-          <w:p>
-            <w:r>
-              <w:t>/stop</w:t>
-            </w:r>
-          </w:p>
-        </w:tc>
-        <w:tc>
-          <w:tcPr>
-            <w:tcW w:type="dxa" w:w="6803"/>
-          </w:tcPr>
-          <w:p>
-            <w:r>
-              <w:t>Pause the bot (no new trades)</w:t>
-            </w:r>
-          </w:p>
-        </w:tc>
-      </w:tr>
-      <w:tr>
-        <w:tc>
-          <w:tcPr>
-            <w:tcW w:type="dxa" w:w="2835"/>
-          </w:tcPr>
-          <w:p>
-            <w:r>
-              <w:t>/help</w:t>
-            </w:r>
-          </w:p>
-        </w:tc>
-        <w:tc>
-          <w:tcPr>
-            <w:tcW w:type="dxa" w:w="6803"/>
-          </w:tcPr>
-          <w:p>
-            <w:r>
-              <w:t>Show all available commands</w:t>
-            </w:r>
-          </w:p>
-        </w:tc>
-      </w:tr>
-    </w:tbl>
-    <w:p>
-      <w:r>
-        <w:br w:type="page"/>
-      </w:r>
-    </w:p>
-    <w:p>
-      <w:pPr>
-        <w:pStyle w:val="Heading1"/>
-      </w:pPr>
-      <w:r>
-        <w:t>6. Trading Workflow</w:t>
-      </w:r>
-    </w:p>
-    <w:p>
-      <w:pPr>
-        <w:pStyle w:val="Heading2"/>
-      </w:pPr>
-      <w:r>
-        <w:t>6.1 Manual BTC Trading</w:t>
-      </w:r>
-    </w:p>
-    <w:p>
-      <w:r>
-        <w:t>Follow these steps to place a manual BTC trade:</w:t>
-      </w:r>
-    </w:p>
-    <w:p>
-      <w:r>
-        <w:t>1. Start the bot: python -X utf8 bot.py</w:t>
-      </w:r>
-    </w:p>
-    <w:p>
-      <w:r>
-        <w:t>2. Open Telegram and go to your bot chat</w:t>
-      </w:r>
-    </w:p>
-    <w:p>
-      <w:r>
-        <w:t>3. Send /buy up to bet BTC will go UP, or /buy down for DOWN</w:t>
-      </w:r>
-    </w:p>
-    <w:p>
-      <w:r>
-        <w:t>4. The bot will find the best available market, place the trade, and confirm</w:t>
-      </w:r>
-    </w:p>
-    <w:p>
-      <w:r>
-        <w:t>5. The bot monitors your position every 5 seconds for TP/SL</w:t>
-      </w:r>
-    </w:p>
-    <w:p>
-      <w:r>
-        <w:t>6. When TP is hit, the bot automatically sells and locks your profit</w:t>
-      </w:r>
-    </w:p>
-    <w:p>
-      <w:r>
-        <w:t>7. When SL is hit, the bot automatically sells to cut losses</w:t>
-      </w:r>
-    </w:p>
-    <w:p>
-      <w:r>
-        <w:t>8. You can manually close anytime with /sell</w:t>
-      </w:r>
-    </w:p>
-    <w:p>
-      <w:r>
-        <w:t>9. Winning tokens are automatically redeemed back to USDC</w:t>
-      </w:r>
-    </w:p>
-    <w:p>
-      <w:pPr>
-        <w:pStyle w:val="Heading2"/>
-      </w:pPr>
-      <w:r>
-        <w:t>6.2 Custom Market Trading</w:t>
-      </w:r>
-    </w:p>
-    <w:p>
-      <w:r>
-        <w:t>To trade on any Polymarket event:</w:t>
-      </w:r>
-    </w:p>
-    <w:p>
-      <w:r>
-        <w:t>1. Search for a market: /search trump or /search bitcoin</w:t>
-      </w:r>
-    </w:p>
-    <w:p>
-      <w:r>
-        <w:t>2. Review the results showing market questions, prices, and liquidity</w:t>
-      </w:r>
-    </w:p>
-    <w:p>
-      <w:r>
-        <w:t>3. Trade on a result: /trade 1 yes to buy "Yes" on result #1</w:t>
-      </w:r>
-    </w:p>
-    <w:p>
-      <w:r>
-        <w:t>4. Or use /trending to see popular markets first</w:t>
-      </w:r>
-    </w:p>
-    <w:p>
-      <w:r>
-        <w:t>5. The bot will place the order and monitor TP/SL as usual</w:t>
-      </w:r>
-    </w:p>
-    <w:p>
-      <w:pPr>
-        <w:pStyle w:val="Heading2"/>
-      </w:pPr>
-      <w:r>
-        <w:t>6.3 Auto-Repeat Mode</w:t>
-      </w:r>
-    </w:p>
-    <w:p>
-      <w:r>
-        <w:t>Auto-repeat mode lets the bot automatically place the same trade direction on the next available market once the current one resolves:</w:t>
-      </w:r>
-    </w:p>
-    <w:p>
-      <w:r>
-        <w:t>1. Enable with /auto up (or /auto down)</w:t>
-      </w:r>
-    </w:p>
-    <w:p>
-      <w:r>
-        <w:t>2. The bot places the first trade immediately if idle</w:t>
-      </w:r>
-    </w:p>
-    <w:p>
-      <w:r>
-        <w:t>3. When the market resolves, it waits for the next market</w:t>
-      </w:r>
-    </w:p>
-    <w:p>
-      <w:r>
-        <w:t>4. When a new market appears, it automatically places the same bet</w:t>
-      </w:r>
-    </w:p>
-    <w:p>
-      <w:r>
-        <w:t>5. Disable anytime with /auto off</w:t>
-      </w:r>
-    </w:p>
-    <w:p>
-      <w:r>
-        <w:t>6. Manual /sell also stops auto-repeat</w:t>
-      </w:r>
-    </w:p>
-    <w:p>
-      <w:pPr>
-        <w:pStyle w:val="Heading1"/>
-      </w:pPr>
-      <w:r>
-        <w:t>7. Risk Management</w:t>
-      </w:r>
-    </w:p>
-    <w:p>
-      <w:r>
-        <w:t>The bot includes several risk management features:</w:t>
-      </w:r>
-    </w:p>
-    <w:p>
-      <w:r>
-        <w:rPr>
-          <w:b/>
-        </w:rPr>
-        <w:t xml:space="preserve">Take-Profit (TP): </w:t>
-      </w:r>
-      <w:r>
-        <w:t>Automatically sells when profit reaches the set percentage (default 80%). Configurable via /set tp &lt;value&gt;.</w:t>
-      </w:r>
-    </w:p>
-    <w:p>
-      <w:r>
-        <w:rPr>
-          <w:b/>
-        </w:rPr>
-        <w:t xml:space="preserve">Stop-Loss (SL): </w:t>
-      </w:r>
-      <w:r>
-        <w:t>Automatically sells when loss reaches the set percentage (default 50%). Configurable via /set sl &lt;value&gt;.</w:t>
-      </w:r>
-    </w:p>
-    <w:p>
-      <w:r>
-        <w:rPr>
-          <w:b/>
-        </w:rPr>
-        <w:t xml:space="preserve">Daily Trade Limit: </w:t>
-      </w:r>
-      <w:r>
-        <w:t>Maximum number of trades per day (default 50). Prevents overtrading. Configurable via /set maxtrades &lt;value&gt;.</w:t>
-      </w:r>
-    </w:p>
-    <w:p>
-      <w:r>
-        <w:rPr>
-          <w:b/>
-        </w:rPr>
-        <w:t xml:space="preserve">Cooldown Period: </w:t>
-      </w:r>
-      <w:r>
-        <w:t>Minimum wait time between trades (default 30 minutes). Configurable via /set cooldown &lt;value&gt;.</w:t>
-      </w:r>
-    </w:p>
-    <w:p>
-      <w:r>
-        <w:rPr>
-          <w:b/>
-        </w:rPr>
-        <w:t xml:space="preserve">Max Slippage: </w:t>
-      </w:r>
-      <w:r>
-        <w:t>Maximum price deviation allowed when placing orders (default $0.05). Configurable via /set slippage &lt;value&gt;.</w:t>
-      </w:r>
-    </w:p>
-    <w:p>
-      <w:r>
-        <w:rPr>
-          <w:b/>
-        </w:rPr>
-        <w:t xml:space="preserve">Fixed vs. Percentage Sizing: </w:t>
-      </w:r>
-      <w:r>
-        <w:t>Trade with a fixed dollar amount or a percentage of your portfolio. Switch with /set size fixed or /set size percent.</w:t>
-      </w:r>
-    </w:p>
-    <w:p>
-      <w:r>
-        <w:rPr>
-          <w:b/>
-        </w:rPr>
-        <w:t xml:space="preserve">Paper Mode: </w:t>
-      </w:r>
-      <w:r>
-        <w:t>Test the bot without risking real money. Set PAPER_MODE=true in .env.</w:t>
-      </w:r>
-    </w:p>
-    <w:p>
-      <w:pPr>
-        <w:pStyle w:val="Heading1"/>
-      </w:pPr>
-      <w:r>
-        <w:t>8. Configuration Reference</w:t>
-      </w:r>
-    </w:p>
-    <w:p>
-      <w:r>
-        <w:t>All configuration is stored in the .env file:</w:t>
-      </w:r>
-    </w:p>
-    <w:tbl>
-      <w:tblPr>
-        <w:tblStyle w:val="LightList-Accent1"/>
-        <w:tblW w:type="auto" w:w="0"/>
-        <w:tblLook w:firstColumn="1" w:firstRow="1" w:lastColumn="0" w:lastRow="0" w:noHBand="0" w:noVBand="1" w:val="04A0"/>
-      </w:tblPr>
-      <w:tblGrid>
-        <w:gridCol w:w="3135"/>
-        <w:gridCol w:w="3135"/>
-        <w:gridCol w:w="3135"/>
-      </w:tblGrid>
-      <w:tr>
-        <w:tc>
-          <w:tcPr>
-            <w:tcW w:type="dxa" w:w="3135"/>
-          </w:tcPr>
-          <w:p>
-            <w:r>
-              <w:t>Variable</w:t>
-            </w:r>
-          </w:p>
-        </w:tc>
-        <w:tc>
-          <w:tcPr>
-            <w:tcW w:type="dxa" w:w="3135"/>
-          </w:tcPr>
-          <w:p>
-            <w:r>
-              <w:t>Default</w:t>
-            </w:r>
-          </w:p>
-        </w:tc>
-        <w:tc>
-          <w:tcPr>
-            <w:tcW w:type="dxa" w:w="3135"/>
-          </w:tcPr>
-          <w:p>
-            <w:r>
-              <w:t>Description</w:t>
-            </w:r>
-          </w:p>
-        </w:tc>
-      </w:tr>
-      <w:tr>
-        <w:tc>
-          <w:tcPr>
-            <w:tcW w:type="dxa" w:w="3135"/>
-          </w:tcPr>
-          <w:p>
-            <w:r>
-              <w:t>PRIVATE_KEY</w:t>
-            </w:r>
-          </w:p>
-        </w:tc>
-        <w:tc>
-          <w:tcPr>
-            <w:tcW w:type="dxa" w:w="3135"/>
-          </w:tcPr>
-          <w:p>
-            <w:r>
-              <w:t>(required)</w:t>
-            </w:r>
-          </w:p>
-        </w:tc>
-        <w:tc>
-          <w:tcPr>
-            <w:tcW w:type="dxa" w:w="3135"/>
-          </w:tcPr>
-          <w:p>
-            <w:r>
-              <w:t>Polygon wallet private key</w:t>
-            </w:r>
-          </w:p>
-        </w:tc>
-      </w:tr>
-      <w:tr>
-        <w:tc>
-          <w:tcPr>
-            <w:tcW w:type="dxa" w:w="3135"/>
-          </w:tcPr>
-          <w:p>
-            <w:r>
-              <w:t>FUNDER_ADDRESS</w:t>
-            </w:r>
-          </w:p>
-        </w:tc>
-        <w:tc>
-          <w:tcPr>
-            <w:tcW w:type="dxa" w:w="3135"/>
-          </w:tcPr>
-          <w:p>
-            <w:r>
-              <w:t>(required)</w:t>
-            </w:r>
-          </w:p>
-        </w:tc>
-        <w:tc>
-          <w:tcPr>
-            <w:tcW w:type="dxa" w:w="3135"/>
-          </w:tcPr>
-          <w:p>
-            <w:r>
-              <w:t>Polygon wallet address</w:t>
-            </w:r>
-          </w:p>
-        </w:tc>
-      </w:tr>
-      <w:tr>
-        <w:tc>
-          <w:tcPr>
-            <w:tcW w:type="dxa" w:w="3135"/>
-          </w:tcPr>
-          <w:p>
-            <w:r>
-              <w:t>TELEGRAM_BOT_TOKEN</w:t>
-            </w:r>
-          </w:p>
-        </w:tc>
-        <w:tc>
-          <w:tcPr>
-            <w:tcW w:type="dxa" w:w="3135"/>
-          </w:tcPr>
-          <w:p>
-            <w:r>
-              <w:t>(required)</w:t>
-            </w:r>
-          </w:p>
-        </w:tc>
-        <w:tc>
-          <w:tcPr>
-            <w:tcW w:type="dxa" w:w="3135"/>
-          </w:tcPr>
-          <w:p>
-            <w:r>
-              <w:t>Telegram bot token</w:t>
-            </w:r>
-          </w:p>
-        </w:tc>
-      </w:tr>
-      <w:tr>
-        <w:tc>
-          <w:tcPr>
-            <w:tcW w:type="dxa" w:w="3135"/>
-          </w:tcPr>
-          <w:p>
-            <w:r>
-              <w:t>TELEGRAM_CHAT_ID</w:t>
-            </w:r>
-          </w:p>
-        </w:tc>
-        <w:tc>
-          <w:tcPr>
-            <w:tcW w:type="dxa" w:w="3135"/>
-          </w:tcPr>
-          <w:p>
-            <w:r>
-              <w:t>(required)</w:t>
-            </w:r>
-          </w:p>
-        </w:tc>
-        <w:tc>
-          <w:tcPr>
-            <w:tcW w:type="dxa" w:w="3135"/>
-          </w:tcPr>
-          <w:p>
-            <w:r>
-              <w:t>Telegram chat ID</w:t>
-            </w:r>
-          </w:p>
-        </w:tc>
-      </w:tr>
-      <w:tr>
-        <w:tc>
-          <w:tcPr>
-            <w:tcW w:type="dxa" w:w="3135"/>
-          </w:tcPr>
-          <w:p>
-            <w:r>
-              <w:t>PAPER_MODE</w:t>
-            </w:r>
-          </w:p>
-        </w:tc>
-        <w:tc>
-          <w:tcPr>
-            <w:tcW w:type="dxa" w:w="3135"/>
-          </w:tcPr>
-          <w:p>
-            <w:r>
-              <w:t>true</w:t>
-            </w:r>
-          </w:p>
-        </w:tc>
-        <w:tc>
-          <w:tcPr>
-            <w:tcW w:type="dxa" w:w="3135"/>
-          </w:tcPr>
-          <w:p>
-            <w:r>
-              <w:t>Paper/live trading mode</w:t>
-            </w:r>
-          </w:p>
-        </w:tc>
-      </w:tr>
-      <w:tr>
-        <w:tc>
-          <w:tcPr>
-            <w:tcW w:type="dxa" w:w="3135"/>
-          </w:tcPr>
-          <w:p>
-            <w:r>
-              <w:t>TRADE_AMOUNT</w:t>
-            </w:r>
-          </w:p>
-        </w:tc>
-        <w:tc>
-          <w:tcPr>
-            <w:tcW w:type="dxa" w:w="3135"/>
-          </w:tcPr>
-          <w:p>
-            <w:r>
-              <w:t>5.00</w:t>
-            </w:r>
-          </w:p>
-        </w:tc>
-        <w:tc>
-          <w:tcPr>
-            <w:tcW w:type="dxa" w:w="3135"/>
-          </w:tcPr>
-          <w:p>
-            <w:r>
-              <w:t>Trade amount in USDC</w:t>
-            </w:r>
-          </w:p>
-        </w:tc>
-      </w:tr>
-      <w:tr>
-        <w:tc>
-          <w:tcPr>
-            <w:tcW w:type="dxa" w:w="3135"/>
-          </w:tcPr>
-          <w:p>
-            <w:r>
-              <w:t>TRADE_SIZE_MODE</w:t>
-            </w:r>
-          </w:p>
-        </w:tc>
-        <w:tc>
-          <w:tcPr>
-            <w:tcW w:type="dxa" w:w="3135"/>
-          </w:tcPr>
-          <w:p>
-            <w:r>
-              <w:t>fixed</w:t>
-            </w:r>
-          </w:p>
-        </w:tc>
-        <w:tc>
-          <w:tcPr>
-            <w:tcW w:type="dxa" w:w="3135"/>
-          </w:tcPr>
-          <w:p>
-            <w:r>
-              <w:t>fixed or percent</w:t>
-            </w:r>
-          </w:p>
-        </w:tc>
-      </w:tr>
-      <w:tr>
-        <w:tc>
-          <w:tcPr>
-            <w:tcW w:type="dxa" w:w="3135"/>
-          </w:tcPr>
-          <w:p>
-            <w:r>
-              <w:t>TRADE_PERCENT</w:t>
-            </w:r>
-          </w:p>
-        </w:tc>
-        <w:tc>
-          <w:tcPr>
-            <w:tcW w:type="dxa" w:w="3135"/>
-          </w:tcPr>
-          <w:p>
-            <w:r>
-              <w:t>5.0</w:t>
-            </w:r>
-          </w:p>
-        </w:tc>
-        <w:tc>
-          <w:tcPr>
-            <w:tcW w:type="dxa" w:w="3135"/>
-          </w:tcPr>
-          <w:p>
-            <w:r>
-              <w:t>Portfolio % per trade</w:t>
-            </w:r>
-          </w:p>
-        </w:tc>
-      </w:tr>
-      <w:tr>
-        <w:tc>
-          <w:tcPr>
-            <w:tcW w:type="dxa" w:w="3135"/>
-          </w:tcPr>
-          <w:p>
-            <w:r>
-              <w:t>TAKE_PROFIT_PCT</w:t>
-            </w:r>
-          </w:p>
-        </w:tc>
-        <w:tc>
-          <w:tcPr>
-            <w:tcW w:type="dxa" w:w="3135"/>
-          </w:tcPr>
-          <w:p>
-            <w:r>
-              <w:t>80</w:t>
-            </w:r>
-          </w:p>
-        </w:tc>
-        <w:tc>
-          <w:tcPr>
-            <w:tcW w:type="dxa" w:w="3135"/>
-          </w:tcPr>
-          <w:p>
-            <w:r>
-              <w:t>Take-profit percentage</w:t>
-            </w:r>
-          </w:p>
-        </w:tc>
-      </w:tr>
-      <w:tr>
-        <w:tc>
-          <w:tcPr>
-            <w:tcW w:type="dxa" w:w="3135"/>
-          </w:tcPr>
-          <w:p>
-            <w:r>
-              <w:t>STOP_LOSS_PCT</w:t>
-            </w:r>
-          </w:p>
-        </w:tc>
-        <w:tc>
-          <w:tcPr>
-            <w:tcW w:type="dxa" w:w="3135"/>
-          </w:tcPr>
-          <w:p>
-            <w:r>
-              <w:t>50</w:t>
-            </w:r>
-          </w:p>
-        </w:tc>
-        <w:tc>
-          <w:tcPr>
-            <w:tcW w:type="dxa" w:w="3135"/>
-          </w:tcPr>
-          <w:p>
-            <w:r>
-              <w:t>Stop-loss percentage</w:t>
-            </w:r>
-          </w:p>
-        </w:tc>
-      </w:tr>
-      <w:tr>
-        <w:tc>
-          <w:tcPr>
-            <w:tcW w:type="dxa" w:w="3135"/>
-          </w:tcPr>
-          <w:p>
-            <w:r>
-              <w:t>SHARE_PRICE</w:t>
-            </w:r>
-          </w:p>
-        </w:tc>
-        <w:tc>
-          <w:tcPr>
-            <w:tcW w:type="dxa" w:w="3135"/>
-          </w:tcPr>
-          <w:p>
-            <w:r>
-              <w:t>0.50</w:t>
-            </w:r>
-          </w:p>
-        </w:tc>
-        <w:tc>
-          <w:tcPr>
-            <w:tcW w:type="dxa" w:w="3135"/>
-          </w:tcPr>
-          <w:p>
-            <w:r>
-              <w:t>Target share price</w:t>
-            </w:r>
-          </w:p>
-        </w:tc>
-      </w:tr>
-      <w:tr>
-        <w:tc>
-          <w:tcPr>
-            <w:tcW w:type="dxa" w:w="3135"/>
-          </w:tcPr>
-          <w:p>
-            <w:r>
-              <w:t>MAX_SLIPPAGE</w:t>
-            </w:r>
-          </w:p>
-        </w:tc>
-        <w:tc>
-          <w:tcPr>
-            <w:tcW w:type="dxa" w:w="3135"/>
-          </w:tcPr>
-          <w:p>
-            <w:r>
-              <w:t>0.05</w:t>
-            </w:r>
-          </w:p>
-        </w:tc>
-        <w:tc>
-          <w:tcPr>
-            <w:tcW w:type="dxa" w:w="3135"/>
-          </w:tcPr>
-          <w:p>
-            <w:r>
-              <w:t>Max slippage in USDC</w:t>
-            </w:r>
-          </w:p>
-        </w:tc>
-      </w:tr>
-      <w:tr>
-        <w:tc>
-          <w:tcPr>
-            <w:tcW w:type="dxa" w:w="3135"/>
-          </w:tcPr>
-          <w:p>
-            <w:r>
-              <w:t>MARKET_TIMEFRAMES</w:t>
-            </w:r>
-          </w:p>
-        </w:tc>
-        <w:tc>
-          <w:tcPr>
-            <w:tcW w:type="dxa" w:w="3135"/>
-          </w:tcPr>
-          <w:p>
-            <w:r>
-              <w:t>15m</w:t>
-            </w:r>
-          </w:p>
-        </w:tc>
-        <w:tc>
-          <w:tcPr>
-            <w:tcW w:type="dxa" w:w="3135"/>
-          </w:tcPr>
-          <w:p>
-            <w:r>
-              <w:t>Comma-separated timeframes</w:t>
-            </w:r>
-          </w:p>
-        </w:tc>
-      </w:tr>
-      <w:tr>
-        <w:tc>
-          <w:tcPr>
-            <w:tcW w:type="dxa" w:w="3135"/>
-          </w:tcPr>
-          <w:p>
-            <w:r>
-              <w:t>TICK_INTERVAL</w:t>
-            </w:r>
-          </w:p>
-        </w:tc>
-        <w:tc>
-          <w:tcPr>
-            <w:tcW w:type="dxa" w:w="3135"/>
-          </w:tcPr>
-          <w:p>
-            <w:r>
-              <w:t>5</w:t>
-            </w:r>
-          </w:p>
-        </w:tc>
-        <w:tc>
-          <w:tcPr>
-            <w:tcW w:type="dxa" w:w="3135"/>
-          </w:tcPr>
-          <w:p>
-            <w:r>
-              <w:t>Price check interval (sec)</w:t>
-            </w:r>
-          </w:p>
-        </w:tc>
-      </w:tr>
-      <w:tr>
-        <w:tc>
-          <w:tcPr>
-            <w:tcW w:type="dxa" w:w="3135"/>
-          </w:tcPr>
-          <w:p>
-            <w:r>
-              <w:t>COOLDOWN_MINUTES</w:t>
-            </w:r>
-          </w:p>
-        </w:tc>
-        <w:tc>
-          <w:tcPr>
-            <w:tcW w:type="dxa" w:w="3135"/>
-          </w:tcPr>
-          <w:p>
-            <w:r>
-              <w:t>30</w:t>
-            </w:r>
-          </w:p>
-        </w:tc>
-        <w:tc>
-          <w:tcPr>
-            <w:tcW w:type="dxa" w:w="3135"/>
-          </w:tcPr>
-          <w:p>
-            <w:r>
-              <w:t>Cooldown between trades</w:t>
-            </w:r>
-          </w:p>
-        </w:tc>
-      </w:tr>
-      <w:tr>
-        <w:tc>
-          <w:tcPr>
-            <w:tcW w:type="dxa" w:w="3135"/>
-          </w:tcPr>
-          <w:p>
-            <w:r>
-              <w:t>MAX_ENTRY_WAIT</w:t>
-            </w:r>
-          </w:p>
-        </w:tc>
-        <w:tc>
-          <w:tcPr>
-            <w:tcW w:type="dxa" w:w="3135"/>
-          </w:tcPr>
-          <w:p>
-            <w:r>
-              <w:t>5</w:t>
-            </w:r>
-          </w:p>
-        </w:tc>
-        <w:tc>
-          <w:tcPr>
-            <w:tcW w:type="dxa" w:w="3135"/>
-          </w:tcPr>
-          <w:p>
-            <w:r>
-              <w:t>Max wait for order fill (min)</w:t>
-            </w:r>
-          </w:p>
-        </w:tc>
-      </w:tr>
-      <w:tr>
-        <w:tc>
-          <w:tcPr>
-            <w:tcW w:type="dxa" w:w="3135"/>
-          </w:tcPr>
-          <w:p>
-            <w:r>
-              <w:t>AUTO_REPEAT</w:t>
-            </w:r>
-          </w:p>
-        </w:tc>
-        <w:tc>
-          <w:tcPr>
-            <w:tcW w:type="dxa" w:w="3135"/>
-          </w:tcPr>
-          <w:p>
-            <w:r>
-              <w:t>false</w:t>
-            </w:r>
-          </w:p>
-        </w:tc>
-        <w:tc>
-          <w:tcPr>
-            <w:tcW w:type="dxa" w:w="3135"/>
-          </w:tcPr>
-          <w:p>
-            <w:r>
-              <w:t>Auto-repeat on market resolve</w:t>
-            </w:r>
-          </w:p>
-        </w:tc>
-      </w:tr>
-      <w:tr>
-        <w:tc>
-          <w:tcPr>
-            <w:tcW w:type="dxa" w:w="3135"/>
-          </w:tcPr>
-          <w:p>
-            <w:r>
-              <w:t>MAX_TRADES_PER_DAY</w:t>
-            </w:r>
-          </w:p>
-        </w:tc>
-        <w:tc>
-          <w:tcPr>
-            <w:tcW w:type="dxa" w:w="3135"/>
-          </w:tcPr>
-          <w:p>
-            <w:r>
-              <w:t>50</w:t>
-            </w:r>
-          </w:p>
-        </w:tc>
-        <w:tc>
-          <w:tcPr>
-            <w:tcW w:type="dxa" w:w="3135"/>
-          </w:tcPr>
-          <w:p>
-            <w:r>
-              <w:t>Daily trade limit</w:t>
+              <w:t>Set active timeframes for market scanning.</w:t>
             </w:r>
           </w:p>
         </w:tc>
@@ -3204,58 +725,53 @@
         <w:pStyle w:val="Heading1"/>
       </w:pPr>
       <w:r>
-        <w:t>9. Auto-Redeem Feature</w:t>
+        <w:t>4. Excel Logging System</w:t>
       </w:r>
     </w:p>
     <w:p>
       <w:r>
-        <w:t>When a trade closes in profit (Take-Profit hit, manual sell with profit, or market win), the bot automatically attempts to redeem the winning conditional tokens back into USDC. This ensures your profits are converted to spendable funds without manual intervention.</w:t>
+        <w:t>The bot maintains two major Excel files for your records:</w:t>
+      </w:r>
+    </w:p>
+    <w:p>
+      <w:pPr>
+        <w:pStyle w:val="Heading2"/>
+      </w:pPr>
+      <w:r>
+        <w:t>trade_log.xlsx (Live Data)</w:t>
       </w:r>
     </w:p>
     <w:p>
       <w:r>
-        <w:t>How it works:</w:t>
+        <w:t>- Sheet 'Trades': Every buy/sell with exit reasons, P&amp;L, and durations.</w:t>
       </w:r>
     </w:p>
     <w:p>
       <w:r>
-        <w:t>1. Trade closes in profit (TP hit, /sell with profit, or market resolves in your favor)</w:t>
+        <w:t>- Sheet 'Events': Bot start/stop, errors, and manual actions.</w:t>
       </w:r>
     </w:p>
     <w:p>
       <w:r>
-        <w:t>2. Bot waits 5 seconds for the market to fully settle</w:t>
+        <w:t>- Sheet 'Summary': Auto-updating total stats (Win Rate, Total P&amp;L).</w:t>
+      </w:r>
+    </w:p>
+    <w:p>
+      <w:pPr>
+        <w:pStyle w:val="Heading2"/>
+      </w:pPr>
+      <w:r>
+        <w:t>backtest_log.xlsx (Simulated Data)</w:t>
       </w:r>
     </w:p>
     <w:p>
       <w:r>
-        <w:t>3. The redeem manager scans for redeemable positions on the blockchain</w:t>
+        <w:t>- Sheet 'Summary': Advanced metrics like Return %, Max Drawdown, and Profit Factor.</w:t>
       </w:r>
     </w:p>
     <w:p>
       <w:r>
-        <w:t>4. Winning tokens are redeemed via the CTF (Conditional Token Framework) contract</w:t>
-      </w:r>
-    </w:p>
-    <w:p>
-      <w:r>
-        <w:t>5. USDC is credited to your wallet</w:t>
-      </w:r>
-    </w:p>
-    <w:p>
-      <w:r>
-        <w:t>6. A Telegram notification confirms the redemption and shows your new balance</w:t>
-      </w:r>
-    </w:p>
-    <w:p>
-      <w:r>
-        <w:rPr>
-          <w:b/>
-        </w:rPr>
-        <w:t xml:space="preserve">Note: </w:t>
-      </w:r>
-      <w:r>
-        <w:t>Some markets may take time to fully settle on-chain. If auto-redeem reports "no positions to redeem", the tokens may become redeemable after a short delay. The bot will attempt redemption at the next trade close.</w:t>
+        <w:t>- Sheet 'Daily': Day-by-day P&amp;L breakdown for performance tracking.</w:t>
       </w:r>
     </w:p>
     <w:p>
@@ -3263,203 +779,32 @@
         <w:pStyle w:val="Heading1"/>
       </w:pPr>
       <w:r>
-        <w:t>10. Troubleshooting</w:t>
+        <w:t>5. Getting Started</w:t>
       </w:r>
     </w:p>
     <w:p>
       <w:r>
-        <w:rPr>
-          <w:b/>
-        </w:rPr>
-        <w:t>Issue: Bot does not respond to commands</w:t>
+        <w:t>1. Configure your '.env' file with Private Key, Foundry Address, and Telegram credentials.</w:t>
       </w:r>
     </w:p>
     <w:p>
       <w:r>
-        <w:t>Solution: Ensure the bot is running (python bot.py). Check that TELEGRAM_BOT_TOKEN and TELEGRAM_CHAT_ID are correctly set in .env. Make sure you started a chat with the bot first.</w:t>
-      </w:r>
-    </w:p>
-    <w:p/>
-    <w:p>
-      <w:r>
-        <w:rPr>
-          <w:b/>
-        </w:rPr>
-        <w:t>Issue: Trade fails with "No active market"</w:t>
+        <w:t>2. Run 'python bot.py' to start.</w:t>
       </w:r>
     </w:p>
     <w:p>
       <w:r>
-        <w:t>Solution: BTC UP/DOWN markets may not be available at all times. Try a different timeframe (e.g., /buy up 5m, /buy up 1h) or wait for a new market to open.</w:t>
-      </w:r>
-    </w:p>
-    <w:p/>
-    <w:p>
-      <w:r>
-        <w:rPr>
-          <w:b/>
-        </w:rPr>
-        <w:t>Issue: Allowance errors</w:t>
+        <w:t>3. Use /start in Telegram to resume trading.</w:t>
       </w:r>
     </w:p>
     <w:p>
       <w:r>
-        <w:t>Solution: Run python setup_allowances.py to approve token spending. Make sure you have enough POL for gas fees (minimum 0.01 POL).</w:t>
-      </w:r>
-    </w:p>
-    <w:p/>
-    <w:p>
-      <w:r>
-        <w:rPr>
-          <w:b/>
-        </w:rPr>
-        <w:t>Issue: USDC balance is 0</w:t>
-      </w:r>
-    </w:p>
-    <w:p>
-      <w:r>
-        <w:t>Solution: Send USDC.e to your wallet address on the Polygon network. You can check your address with /balance.</w:t>
-      </w:r>
-    </w:p>
-    <w:p/>
-    <w:p>
-      <w:r>
-        <w:rPr>
-          <w:b/>
-        </w:rPr>
-        <w:t>Issue: "Rate limited" errors</w:t>
-      </w:r>
-    </w:p>
-    <w:p>
-      <w:r>
-        <w:t>Solution: The Polygon RPC may be rate-limiting requests. The bot includes retry logic with automatic backoff. If persistent, try using a premium RPC endpoint.</w:t>
-      </w:r>
-    </w:p>
-    <w:p/>
-    <w:p>
-      <w:r>
-        <w:rPr>
-          <w:b/>
-        </w:rPr>
-        <w:t>Issue: Bot sends double messages</w:t>
-      </w:r>
-    </w:p>
-    <w:p>
-      <w:r>
-        <w:t>Solution: This was fixed in v3.3. Make sure you are running the latest version. Pull the latest code with: git pull origin main</w:t>
-      </w:r>
-    </w:p>
-    <w:p/>
-    <w:p>
-      <w:r>
-        <w:rPr>
-          <w:b/>
-        </w:rPr>
-        <w:t>Issue: Search returns no results</w:t>
-      </w:r>
-    </w:p>
-    <w:p>
-      <w:r>
-        <w:t>Solution: The search queries up to 200 active markets. Try broader keywords. Some markets may not be currently active.</w:t>
-      </w:r>
-    </w:p>
-    <w:p/>
-    <w:p>
-      <w:pPr>
-        <w:pStyle w:val="Heading1"/>
-      </w:pPr>
-      <w:r>
-        <w:t>11. Security Best Practices</w:t>
-      </w:r>
-    </w:p>
-    <w:p>
-      <w:pPr>
-        <w:pStyle w:val="ListBullet"/>
-      </w:pPr>
-      <w:r>
-        <w:t>Never share your .env file or private key with anyone</w:t>
-      </w:r>
-    </w:p>
-    <w:p>
-      <w:pPr>
-        <w:pStyle w:val="ListBullet"/>
-      </w:pPr>
-      <w:r>
-        <w:t>The .env file is excluded from Git via .gitignore</w:t>
-      </w:r>
-    </w:p>
-    <w:p>
-      <w:pPr>
-        <w:pStyle w:val="ListBullet"/>
-      </w:pPr>
-      <w:r>
-        <w:t>Use a dedicated wallet for the bot — do not use your main wallet</w:t>
-      </w:r>
-    </w:p>
-    <w:p>
-      <w:pPr>
-        <w:pStyle w:val="ListBullet"/>
-      </w:pPr>
-      <w:r>
-        <w:t>Start with Paper Mode (PAPER_MODE=true) for testing</w:t>
-      </w:r>
-    </w:p>
-    <w:p>
-      <w:pPr>
-        <w:pStyle w:val="ListBullet"/>
-      </w:pPr>
-      <w:r>
-        <w:t>Start with small amounts when going live ($5-10 per trade)</w:t>
-      </w:r>
-    </w:p>
-    <w:p>
-      <w:pPr>
-        <w:pStyle w:val="ListBullet"/>
-      </w:pPr>
-      <w:r>
-        <w:t>Monitor the bot regularly via Telegram /status and /pnl commands</w:t>
-      </w:r>
-    </w:p>
-    <w:p>
-      <w:pPr>
-        <w:pStyle w:val="ListBullet"/>
-      </w:pPr>
-      <w:r>
-        <w:t>Keep your system updated with security patches</w:t>
-      </w:r>
-    </w:p>
-    <w:p>
-      <w:pPr>
-        <w:pStyle w:val="ListBullet"/>
-      </w:pPr>
-      <w:r>
-        <w:t>Use a strong, unique Telegram bot token</w:t>
-      </w:r>
-    </w:p>
-    <w:p>
-      <w:pPr>
-        <w:pStyle w:val="ListBullet"/>
-      </w:pPr>
-      <w:r>
-        <w:t>Regularly check your wallet balance with /balance</w:t>
-      </w:r>
-    </w:p>
-    <w:p/>
-    <w:p>
-      <w:r>
-        <w:rPr>
-          <w:b/>
-          <w:color w:val="CC0000"/>
-        </w:rPr>
-        <w:t xml:space="preserve">DISCLAIMER: </w:t>
-      </w:r>
-      <w:r>
-        <w:t>Trading on prediction markets involves significant risk. Past performance does not guarantee future results. Only trade with funds you can afford to lose. The developers are not responsible for any financial losses incurred while using this bot.</w:t>
+        <w:t>4. Use /history or /export live anytime to verify your data.</w:t>
       </w:r>
     </w:p>
     <w:sectPr>
       <w:pgSz w:w="12240" w:h="15840"/>
-      <w:pgMar w:top="1417" w:right="1417" w:bottom="1417" w:left="1417" w:header="720" w:footer="720" w:gutter="0"/>
+      <w:pgMar w:top="1440" w:right="1800" w:bottom="1440" w:left="1800" w:header="720" w:footer="720" w:gutter="0"/>
       <w:cols w:space="720"/>
       <w:docGrid w:linePitch="360"/>
     </w:sectPr>
@@ -3832,7 +1177,6 @@
     <w:rsid w:val="00FC693F"/>
     <w:rPr>
       <w:rFonts w:ascii="Calibri" w:hAnsi="Calibri"/>
-      <w:color w:val="333333"/>
       <w:sz w:val="22"/>
     </w:rPr>
   </w:style>
@@ -3895,11 +1239,11 @@
       <w:outlineLvl w:val="0"/>
     </w:pPr>
     <w:rPr>
-      <w:rFonts w:asciiTheme="majorHAnsi" w:eastAsiaTheme="majorEastAsia" w:hAnsiTheme="majorHAnsi" w:cstheme="majorBidi" w:ascii="Calibri" w:hAnsi="Calibri"/>
+      <w:rFonts w:asciiTheme="majorHAnsi" w:eastAsiaTheme="majorEastAsia" w:hAnsiTheme="majorHAnsi" w:cstheme="majorBidi"/>
       <w:b/>
       <w:bCs/>
-      <w:color w:val="1A1A2E"/>
-      <w:sz w:val="44"/>
+      <w:color w:val="365F91" w:themeColor="accent1" w:themeShade="BF"/>
+      <w:sz w:val="28"/>
       <w:szCs w:val="28"/>
     </w:rPr>
   </w:style>
@@ -3919,11 +1263,11 @@
       <w:outlineLvl w:val="1"/>
     </w:pPr>
     <w:rPr>
-      <w:rFonts w:asciiTheme="majorHAnsi" w:eastAsiaTheme="majorEastAsia" w:hAnsiTheme="majorHAnsi" w:cstheme="majorBidi" w:ascii="Calibri" w:hAnsi="Calibri"/>
+      <w:rFonts w:asciiTheme="majorHAnsi" w:eastAsiaTheme="majorEastAsia" w:hAnsiTheme="majorHAnsi" w:cstheme="majorBidi"/>
       <w:b/>
       <w:bCs/>
-      <w:color w:val="1A1A2E"/>
-      <w:sz w:val="32"/>
+      <w:color w:val="4F81BD" w:themeColor="accent1"/>
+      <w:sz w:val="26"/>
       <w:szCs w:val="26"/>
     </w:rPr>
   </w:style>
@@ -3943,11 +1287,10 @@
       <w:outlineLvl w:val="2"/>
     </w:pPr>
     <w:rPr>
-      <w:rFonts w:asciiTheme="majorHAnsi" w:eastAsiaTheme="majorEastAsia" w:hAnsiTheme="majorHAnsi" w:cstheme="majorBidi" w:ascii="Calibri" w:hAnsi="Calibri"/>
+      <w:rFonts w:asciiTheme="majorHAnsi" w:eastAsiaTheme="majorEastAsia" w:hAnsiTheme="majorHAnsi" w:cstheme="majorBidi"/>
       <w:b/>
       <w:bCs/>
-      <w:color w:val="1A1A2E"/>
-      <w:sz w:val="26"/>
+      <w:color w:val="4F81BD" w:themeColor="accent1"/>
     </w:rPr>
   </w:style>
   <w:style w:type="paragraph" w:styleId="Heading4">

</xml_diff>